<commit_message>
Revise budget table v2: group gray rows on top, white total 7M (VAT incl.)
- Add gray rows: SNS 초안 제작비, 전체 계획 및 발주 획득 관리, 결과보고서 작성 완성
- Add white row: 결과보고서 재료 정리 및 저장
- Reorder so all 회색(온나무 직접) rows are on top, 흰색(용역사) below
- Adjust unit prices so white total = 7,000,000 KRW including VAT

Co-Authored-By: Claude Opus 4.8 <noreply@anthropic.com>
Claude-Session: https://claude.ai/code/session_012Vguj5rDAwpmTc2kBVw8x2
</commit_message>
<xml_diff>
--- a/2026_한복인문학특강_상세예산표_내부용.docx
+++ b/2026_한복인문학특강_상세예산표_내부용.docx
@@ -22,7 +22,7 @@
           <w:color w:val="606060"/>
           <w:sz w:val="18"/>
         </w:rPr>
-        <w:t>※ 회색 음영 = 온나무 직접 수행 영역(내부 처리) / 백색 = 용역사 위탁 범위</w:t>
+        <w:t>※ 회색 음영 = 온나무 직접 수행 영역(내부 처리, 상단) / 백색 = 용역사 위탁 범위(하단, 합계 7,000,000원 부가세 포함)</w:t>
       </w:r>
     </w:p>
     <w:tbl>
@@ -389,7 +389,7 @@
                 <w:b w:val="0"/>
                 <w:sz w:val="18"/>
               </w:rPr>
-              <w:t>기획팀(온나무 직접)</w:t>
+              <w:t>기획팀(온나무)</w:t>
             </w:r>
           </w:p>
         </w:tc>
@@ -418,6 +418,7 @@
         <w:tc>
           <w:tcPr>
             <w:tcW w:type="dxa" w:w="1133"/>
+            <w:shd w:val="clear" w:color="auto" w:fill="D9D9D9"/>
           </w:tcPr>
           <w:p>
             <w:pPr>
@@ -431,867 +432,6 @@
                 <w:sz w:val="18"/>
               </w:rPr>
               <w:t>2</w:t>
-            </w:r>
-          </w:p>
-        </w:tc>
-        <w:tc>
-          <w:tcPr>
-            <w:tcW w:type="dxa" w:w="1133"/>
-          </w:tcPr>
-          <w:p>
-            <w:pPr>
-              <w:jc w:val="center"/>
-            </w:pPr>
-            <w:r/>
-            <w:r>
-              <w:rPr>
-                <w:rFonts w:ascii="맑은 고딕" w:hAnsi="맑은 고딕" w:eastAsia="맑은 고딕"/>
-                <w:b w:val="0"/>
-                <w:sz w:val="18"/>
-              </w:rPr>
-              <w:t>인건비</w:t>
-            </w:r>
-          </w:p>
-        </w:tc>
-        <w:tc>
-          <w:tcPr>
-            <w:tcW w:type="dxa" w:w="1133"/>
-          </w:tcPr>
-          <w:p>
-            <w:pPr>
-              <w:jc w:val="left"/>
-            </w:pPr>
-            <w:r/>
-            <w:r>
-              <w:rPr>
-                <w:rFonts w:ascii="맑은 고딕" w:hAnsi="맑은 고딕" w:eastAsia="맑은 고딕"/>
-                <w:b w:val="0"/>
-                <w:sz w:val="18"/>
-              </w:rPr>
-              <w:t>사회진행비</w:t>
-            </w:r>
-          </w:p>
-        </w:tc>
-        <w:tc>
-          <w:tcPr>
-            <w:tcW w:type="dxa" w:w="1133"/>
-          </w:tcPr>
-          <w:p>
-            <w:pPr>
-              <w:jc w:val="center"/>
-            </w:pPr>
-            <w:r/>
-            <w:r>
-              <w:rPr>
-                <w:rFonts w:ascii="맑은 고딕" w:hAnsi="맑은 고딕" w:eastAsia="맑은 고딕"/>
-                <w:b w:val="0"/>
-                <w:sz w:val="18"/>
-              </w:rPr>
-              <w:t>회</w:t>
-            </w:r>
-          </w:p>
-        </w:tc>
-        <w:tc>
-          <w:tcPr>
-            <w:tcW w:type="dxa" w:w="1133"/>
-          </w:tcPr>
-          <w:p>
-            <w:pPr>
-              <w:jc w:val="center"/>
-            </w:pPr>
-            <w:r/>
-            <w:r>
-              <w:rPr>
-                <w:rFonts w:ascii="맑은 고딕" w:hAnsi="맑은 고딕" w:eastAsia="맑은 고딕"/>
-                <w:b w:val="0"/>
-                <w:sz w:val="18"/>
-              </w:rPr>
-              <w:t>6</w:t>
-            </w:r>
-          </w:p>
-        </w:tc>
-        <w:tc>
-          <w:tcPr>
-            <w:tcW w:type="dxa" w:w="1133"/>
-          </w:tcPr>
-          <w:p>
-            <w:pPr>
-              <w:jc w:val="right"/>
-            </w:pPr>
-            <w:r/>
-            <w:r>
-              <w:rPr>
-                <w:rFonts w:ascii="맑은 고딕" w:hAnsi="맑은 고딕" w:eastAsia="맑은 고딕"/>
-                <w:b w:val="0"/>
-                <w:sz w:val="18"/>
-              </w:rPr>
-              <w:t>361,000</w:t>
-            </w:r>
-          </w:p>
-        </w:tc>
-        <w:tc>
-          <w:tcPr>
-            <w:tcW w:type="dxa" w:w="1133"/>
-          </w:tcPr>
-          <w:p>
-            <w:pPr>
-              <w:jc w:val="right"/>
-            </w:pPr>
-            <w:r/>
-            <w:r>
-              <w:rPr>
-                <w:rFonts w:ascii="맑은 고딕" w:hAnsi="맑은 고딕" w:eastAsia="맑은 고딕"/>
-                <w:b w:val="0"/>
-                <w:sz w:val="18"/>
-              </w:rPr>
-              <w:t>2,166,000</w:t>
-            </w:r>
-          </w:p>
-        </w:tc>
-        <w:tc>
-          <w:tcPr>
-            <w:tcW w:type="dxa" w:w="1133"/>
-          </w:tcPr>
-          <w:p>
-            <w:pPr>
-              <w:jc w:val="center"/>
-            </w:pPr>
-            <w:r/>
-            <w:r>
-              <w:rPr>
-                <w:rFonts w:ascii="맑은 고딕" w:hAnsi="맑은 고딕" w:eastAsia="맑은 고딕"/>
-                <w:b w:val="0"/>
-                <w:sz w:val="18"/>
-              </w:rPr>
-              <w:t>현장운영(로컬 협업 매니저)</w:t>
-            </w:r>
-          </w:p>
-        </w:tc>
-        <w:tc>
-          <w:tcPr>
-            <w:tcW w:type="dxa" w:w="1133"/>
-          </w:tcPr>
-          <w:p>
-            <w:pPr>
-              <w:jc w:val="left"/>
-            </w:pPr>
-            <w:r/>
-            <w:r>
-              <w:rPr>
-                <w:rFonts w:ascii="맑은 고딕" w:hAnsi="맑은 고딕" w:eastAsia="맑은 고딕"/>
-                <w:b w:val="0"/>
-                <w:sz w:val="18"/>
-              </w:rPr>
-              <w:t>사회자 교통비 포함</w:t>
-            </w:r>
-          </w:p>
-        </w:tc>
-      </w:tr>
-      <w:tr>
-        <w:tc>
-          <w:tcPr>
-            <w:tcW w:type="dxa" w:w="1133"/>
-          </w:tcPr>
-          <w:p>
-            <w:pPr>
-              <w:jc w:val="center"/>
-            </w:pPr>
-            <w:r/>
-            <w:r>
-              <w:rPr>
-                <w:rFonts w:ascii="맑은 고딕" w:hAnsi="맑은 고딕" w:eastAsia="맑은 고딕"/>
-                <w:b w:val="0"/>
-                <w:sz w:val="18"/>
-              </w:rPr>
-              <w:t>3</w:t>
-            </w:r>
-          </w:p>
-        </w:tc>
-        <w:tc>
-          <w:tcPr>
-            <w:tcW w:type="dxa" w:w="1133"/>
-          </w:tcPr>
-          <w:p>
-            <w:pPr>
-              <w:jc w:val="center"/>
-            </w:pPr>
-            <w:r/>
-            <w:r>
-              <w:rPr>
-                <w:rFonts w:ascii="맑은 고딕" w:hAnsi="맑은 고딕" w:eastAsia="맑은 고딕"/>
-                <w:b w:val="0"/>
-                <w:sz w:val="18"/>
-              </w:rPr>
-              <w:t>제작비</w:t>
-            </w:r>
-          </w:p>
-        </w:tc>
-        <w:tc>
-          <w:tcPr>
-            <w:tcW w:type="dxa" w:w="1133"/>
-          </w:tcPr>
-          <w:p>
-            <w:pPr>
-              <w:jc w:val="left"/>
-            </w:pPr>
-            <w:r/>
-            <w:r>
-              <w:rPr>
-                <w:rFonts w:ascii="맑은 고딕" w:hAnsi="맑은 고딕" w:eastAsia="맑은 고딕"/>
-                <w:b w:val="0"/>
-                <w:sz w:val="18"/>
-              </w:rPr>
-              <w:t>행사 사진·영상 촬영 및 편집</w:t>
-            </w:r>
-          </w:p>
-        </w:tc>
-        <w:tc>
-          <w:tcPr>
-            <w:tcW w:type="dxa" w:w="1133"/>
-          </w:tcPr>
-          <w:p>
-            <w:pPr>
-              <w:jc w:val="center"/>
-            </w:pPr>
-            <w:r/>
-            <w:r>
-              <w:rPr>
-                <w:rFonts w:ascii="맑은 고딕" w:hAnsi="맑은 고딕" w:eastAsia="맑은 고딕"/>
-                <w:b w:val="0"/>
-                <w:sz w:val="18"/>
-              </w:rPr>
-              <w:t>식</w:t>
-            </w:r>
-          </w:p>
-        </w:tc>
-        <w:tc>
-          <w:tcPr>
-            <w:tcW w:type="dxa" w:w="1133"/>
-          </w:tcPr>
-          <w:p>
-            <w:pPr>
-              <w:jc w:val="center"/>
-            </w:pPr>
-            <w:r/>
-            <w:r>
-              <w:rPr>
-                <w:rFonts w:ascii="맑은 고딕" w:hAnsi="맑은 고딕" w:eastAsia="맑은 고딕"/>
-                <w:b w:val="0"/>
-                <w:sz w:val="18"/>
-              </w:rPr>
-              <w:t>1</w:t>
-            </w:r>
-          </w:p>
-        </w:tc>
-        <w:tc>
-          <w:tcPr>
-            <w:tcW w:type="dxa" w:w="1133"/>
-          </w:tcPr>
-          <w:p>
-            <w:pPr>
-              <w:jc w:val="right"/>
-            </w:pPr>
-            <w:r/>
-            <w:r>
-              <w:rPr>
-                <w:rFonts w:ascii="맑은 고딕" w:hAnsi="맑은 고딕" w:eastAsia="맑은 고딕"/>
-                <w:b w:val="0"/>
-                <w:sz w:val="18"/>
-              </w:rPr>
-              <w:t>2,232,500</w:t>
-            </w:r>
-          </w:p>
-        </w:tc>
-        <w:tc>
-          <w:tcPr>
-            <w:tcW w:type="dxa" w:w="1133"/>
-          </w:tcPr>
-          <w:p>
-            <w:pPr>
-              <w:jc w:val="right"/>
-            </w:pPr>
-            <w:r/>
-            <w:r>
-              <w:rPr>
-                <w:rFonts w:ascii="맑은 고딕" w:hAnsi="맑은 고딕" w:eastAsia="맑은 고딕"/>
-                <w:b w:val="0"/>
-                <w:sz w:val="18"/>
-              </w:rPr>
-              <w:t>2,232,500</w:t>
-            </w:r>
-          </w:p>
-        </w:tc>
-        <w:tc>
-          <w:tcPr>
-            <w:tcW w:type="dxa" w:w="1133"/>
-          </w:tcPr>
-          <w:p>
-            <w:pPr>
-              <w:jc w:val="center"/>
-            </w:pPr>
-            <w:r/>
-            <w:r>
-              <w:rPr>
-                <w:rFonts w:ascii="맑은 고딕" w:hAnsi="맑은 고딕" w:eastAsia="맑은 고딕"/>
-                <w:b w:val="0"/>
-                <w:sz w:val="18"/>
-              </w:rPr>
-              <w:t>행정·운영지원(영상제작)</w:t>
-            </w:r>
-          </w:p>
-        </w:tc>
-        <w:tc>
-          <w:tcPr>
-            <w:tcW w:type="dxa" w:w="1133"/>
-          </w:tcPr>
-          <w:p>
-            <w:pPr>
-              <w:jc w:val="left"/>
-            </w:pPr>
-            <w:r/>
-            <w:r>
-              <w:rPr>
-                <w:rFonts w:ascii="맑은 고딕" w:hAnsi="맑은 고딕" w:eastAsia="맑은 고딕"/>
-                <w:b w:val="0"/>
-                <w:sz w:val="18"/>
-              </w:rPr>
-              <w:t>최종 결과물 1EA</w:t>
-            </w:r>
-          </w:p>
-        </w:tc>
-      </w:tr>
-      <w:tr>
-        <w:tc>
-          <w:tcPr>
-            <w:tcW w:type="dxa" w:w="1133"/>
-          </w:tcPr>
-          <w:p>
-            <w:pPr>
-              <w:jc w:val="center"/>
-            </w:pPr>
-            <w:r/>
-            <w:r>
-              <w:rPr>
-                <w:rFonts w:ascii="맑은 고딕" w:hAnsi="맑은 고딕" w:eastAsia="맑은 고딕"/>
-                <w:b w:val="0"/>
-                <w:sz w:val="18"/>
-              </w:rPr>
-              <w:t>4</w:t>
-            </w:r>
-          </w:p>
-        </w:tc>
-        <w:tc>
-          <w:tcPr>
-            <w:tcW w:type="dxa" w:w="1133"/>
-          </w:tcPr>
-          <w:p>
-            <w:pPr>
-              <w:jc w:val="center"/>
-            </w:pPr>
-            <w:r/>
-            <w:r>
-              <w:rPr>
-                <w:rFonts w:ascii="맑은 고딕" w:hAnsi="맑은 고딕" w:eastAsia="맑은 고딕"/>
-                <w:b w:val="0"/>
-                <w:sz w:val="18"/>
-              </w:rPr>
-              <w:t>인쇄비</w:t>
-            </w:r>
-          </w:p>
-        </w:tc>
-        <w:tc>
-          <w:tcPr>
-            <w:tcW w:type="dxa" w:w="1133"/>
-          </w:tcPr>
-          <w:p>
-            <w:pPr>
-              <w:jc w:val="left"/>
-            </w:pPr>
-            <w:r/>
-            <w:r>
-              <w:rPr>
-                <w:rFonts w:ascii="맑은 고딕" w:hAnsi="맑은 고딕" w:eastAsia="맑은 고딕"/>
-                <w:b w:val="0"/>
-                <w:sz w:val="18"/>
-              </w:rPr>
-              <w:t>강연자료집 제작 및 인쇄</w:t>
-            </w:r>
-          </w:p>
-        </w:tc>
-        <w:tc>
-          <w:tcPr>
-            <w:tcW w:type="dxa" w:w="1133"/>
-          </w:tcPr>
-          <w:p>
-            <w:pPr>
-              <w:jc w:val="center"/>
-            </w:pPr>
-            <w:r/>
-            <w:r>
-              <w:rPr>
-                <w:rFonts w:ascii="맑은 고딕" w:hAnsi="맑은 고딕" w:eastAsia="맑은 고딕"/>
-                <w:b w:val="0"/>
-                <w:sz w:val="18"/>
-              </w:rPr>
-              <w:t>식</w:t>
-            </w:r>
-          </w:p>
-        </w:tc>
-        <w:tc>
-          <w:tcPr>
-            <w:tcW w:type="dxa" w:w="1133"/>
-          </w:tcPr>
-          <w:p>
-            <w:pPr>
-              <w:jc w:val="center"/>
-            </w:pPr>
-            <w:r/>
-            <w:r>
-              <w:rPr>
-                <w:rFonts w:ascii="맑은 고딕" w:hAnsi="맑은 고딕" w:eastAsia="맑은 고딕"/>
-                <w:b w:val="0"/>
-                <w:sz w:val="18"/>
-              </w:rPr>
-              <w:t>1</w:t>
-            </w:r>
-          </w:p>
-        </w:tc>
-        <w:tc>
-          <w:tcPr>
-            <w:tcW w:type="dxa" w:w="1133"/>
-          </w:tcPr>
-          <w:p>
-            <w:pPr>
-              <w:jc w:val="right"/>
-            </w:pPr>
-            <w:r/>
-            <w:r>
-              <w:rPr>
-                <w:rFonts w:ascii="맑은 고딕" w:hAnsi="맑은 고딕" w:eastAsia="맑은 고딕"/>
-                <w:b w:val="0"/>
-                <w:sz w:val="18"/>
-              </w:rPr>
-              <w:t>1,425,000</w:t>
-            </w:r>
-          </w:p>
-        </w:tc>
-        <w:tc>
-          <w:tcPr>
-            <w:tcW w:type="dxa" w:w="1133"/>
-          </w:tcPr>
-          <w:p>
-            <w:pPr>
-              <w:jc w:val="right"/>
-            </w:pPr>
-            <w:r/>
-            <w:r>
-              <w:rPr>
-                <w:rFonts w:ascii="맑은 고딕" w:hAnsi="맑은 고딕" w:eastAsia="맑은 고딕"/>
-                <w:b w:val="0"/>
-                <w:sz w:val="18"/>
-              </w:rPr>
-              <w:t>1,425,000</w:t>
-            </w:r>
-          </w:p>
-        </w:tc>
-        <w:tc>
-          <w:tcPr>
-            <w:tcW w:type="dxa" w:w="1133"/>
-          </w:tcPr>
-          <w:p>
-            <w:pPr>
-              <w:jc w:val="center"/>
-            </w:pPr>
-            <w:r/>
-            <w:r>
-              <w:rPr>
-                <w:rFonts w:ascii="맑은 고딕" w:hAnsi="맑은 고딕" w:eastAsia="맑은 고딕"/>
-                <w:b w:val="0"/>
-                <w:sz w:val="18"/>
-              </w:rPr>
-              <w:t>제작·인쇄(용역사)</w:t>
-            </w:r>
-          </w:p>
-        </w:tc>
-        <w:tc>
-          <w:tcPr>
-            <w:tcW w:type="dxa" w:w="1133"/>
-          </w:tcPr>
-          <w:p>
-            <w:pPr>
-              <w:jc w:val="left"/>
-            </w:pPr>
-            <w:r/>
-            <w:r>
-              <w:rPr>
-                <w:rFonts w:ascii="맑은 고딕" w:hAnsi="맑은 고딕" w:eastAsia="맑은 고딕"/>
-                <w:b w:val="0"/>
-                <w:sz w:val="18"/>
-              </w:rPr>
-            </w:r>
-          </w:p>
-        </w:tc>
-      </w:tr>
-      <w:tr>
-        <w:tc>
-          <w:tcPr>
-            <w:tcW w:type="dxa" w:w="1133"/>
-          </w:tcPr>
-          <w:p>
-            <w:pPr>
-              <w:jc w:val="center"/>
-            </w:pPr>
-            <w:r/>
-            <w:r>
-              <w:rPr>
-                <w:rFonts w:ascii="맑은 고딕" w:hAnsi="맑은 고딕" w:eastAsia="맑은 고딕"/>
-                <w:b w:val="0"/>
-                <w:sz w:val="18"/>
-              </w:rPr>
-              <w:t>5</w:t>
-            </w:r>
-          </w:p>
-        </w:tc>
-        <w:tc>
-          <w:tcPr>
-            <w:tcW w:type="dxa" w:w="1133"/>
-          </w:tcPr>
-          <w:p>
-            <w:pPr>
-              <w:jc w:val="center"/>
-            </w:pPr>
-            <w:r/>
-            <w:r>
-              <w:rPr>
-                <w:rFonts w:ascii="맑은 고딕" w:hAnsi="맑은 고딕" w:eastAsia="맑은 고딕"/>
-                <w:b w:val="0"/>
-                <w:sz w:val="18"/>
-              </w:rPr>
-              <w:t>제작비</w:t>
-            </w:r>
-          </w:p>
-        </w:tc>
-        <w:tc>
-          <w:tcPr>
-            <w:tcW w:type="dxa" w:w="1133"/>
-          </w:tcPr>
-          <w:p>
-            <w:pPr>
-              <w:jc w:val="left"/>
-            </w:pPr>
-            <w:r/>
-            <w:r>
-              <w:rPr>
-                <w:rFonts w:ascii="맑은 고딕" w:hAnsi="맑은 고딕" w:eastAsia="맑은 고딕"/>
-                <w:b w:val="0"/>
-                <w:sz w:val="18"/>
-              </w:rPr>
-              <w:t>SNS 제작비</w:t>
-            </w:r>
-          </w:p>
-        </w:tc>
-        <w:tc>
-          <w:tcPr>
-            <w:tcW w:type="dxa" w:w="1133"/>
-          </w:tcPr>
-          <w:p>
-            <w:pPr>
-              <w:jc w:val="center"/>
-            </w:pPr>
-            <w:r/>
-            <w:r>
-              <w:rPr>
-                <w:rFonts w:ascii="맑은 고딕" w:hAnsi="맑은 고딕" w:eastAsia="맑은 고딕"/>
-                <w:b w:val="0"/>
-                <w:sz w:val="18"/>
-              </w:rPr>
-              <w:t>식</w:t>
-            </w:r>
-          </w:p>
-        </w:tc>
-        <w:tc>
-          <w:tcPr>
-            <w:tcW w:type="dxa" w:w="1133"/>
-          </w:tcPr>
-          <w:p>
-            <w:pPr>
-              <w:jc w:val="center"/>
-            </w:pPr>
-            <w:r/>
-            <w:r>
-              <w:rPr>
-                <w:rFonts w:ascii="맑은 고딕" w:hAnsi="맑은 고딕" w:eastAsia="맑은 고딕"/>
-                <w:b w:val="0"/>
-                <w:sz w:val="18"/>
-              </w:rPr>
-              <w:t>1</w:t>
-            </w:r>
-          </w:p>
-        </w:tc>
-        <w:tc>
-          <w:tcPr>
-            <w:tcW w:type="dxa" w:w="1133"/>
-          </w:tcPr>
-          <w:p>
-            <w:pPr>
-              <w:jc w:val="right"/>
-            </w:pPr>
-            <w:r/>
-            <w:r>
-              <w:rPr>
-                <w:rFonts w:ascii="맑은 고딕" w:hAnsi="맑은 고딕" w:eastAsia="맑은 고딕"/>
-                <w:b w:val="0"/>
-                <w:sz w:val="18"/>
-              </w:rPr>
-            </w:r>
-          </w:p>
-        </w:tc>
-        <w:tc>
-          <w:tcPr>
-            <w:tcW w:type="dxa" w:w="1133"/>
-          </w:tcPr>
-          <w:p>
-            <w:pPr>
-              <w:jc w:val="right"/>
-            </w:pPr>
-            <w:r/>
-            <w:r>
-              <w:rPr>
-                <w:rFonts w:ascii="맑은 고딕" w:hAnsi="맑은 고딕" w:eastAsia="맑은 고딕"/>
-                <w:b w:val="0"/>
-                <w:sz w:val="18"/>
-              </w:rPr>
-            </w:r>
-          </w:p>
-        </w:tc>
-        <w:tc>
-          <w:tcPr>
-            <w:tcW w:type="dxa" w:w="1133"/>
-          </w:tcPr>
-          <w:p>
-            <w:pPr>
-              <w:jc w:val="center"/>
-            </w:pPr>
-            <w:r/>
-            <w:r>
-              <w:rPr>
-                <w:rFonts w:ascii="맑은 고딕" w:hAnsi="맑은 고딕" w:eastAsia="맑은 고딕"/>
-                <w:b w:val="0"/>
-                <w:sz w:val="18"/>
-              </w:rPr>
-              <w:t>홍보(용역사)</w:t>
-            </w:r>
-          </w:p>
-        </w:tc>
-        <w:tc>
-          <w:tcPr>
-            <w:tcW w:type="dxa" w:w="1133"/>
-          </w:tcPr>
-          <w:p>
-            <w:pPr>
-              <w:jc w:val="left"/>
-            </w:pPr>
-            <w:r/>
-            <w:r>
-              <w:rPr>
-                <w:rFonts w:ascii="맑은 고딕" w:hAnsi="맑은 고딕" w:eastAsia="맑은 고딕"/>
-                <w:b w:val="0"/>
-                <w:sz w:val="18"/>
-              </w:rPr>
-              <w:t>SNS 게시물 제작</w:t>
-            </w:r>
-          </w:p>
-        </w:tc>
-      </w:tr>
-      <w:tr>
-        <w:tc>
-          <w:tcPr>
-            <w:tcW w:type="dxa" w:w="1133"/>
-          </w:tcPr>
-          <w:p>
-            <w:pPr>
-              <w:jc w:val="center"/>
-            </w:pPr>
-            <w:r/>
-            <w:r>
-              <w:rPr>
-                <w:rFonts w:ascii="맑은 고딕" w:hAnsi="맑은 고딕" w:eastAsia="맑은 고딕"/>
-                <w:b w:val="0"/>
-                <w:sz w:val="18"/>
-              </w:rPr>
-              <w:t>6</w:t>
-            </w:r>
-          </w:p>
-        </w:tc>
-        <w:tc>
-          <w:tcPr>
-            <w:tcW w:type="dxa" w:w="1133"/>
-          </w:tcPr>
-          <w:p>
-            <w:pPr>
-              <w:jc w:val="center"/>
-            </w:pPr>
-            <w:r/>
-            <w:r>
-              <w:rPr>
-                <w:rFonts w:ascii="맑은 고딕" w:hAnsi="맑은 고딕" w:eastAsia="맑은 고딕"/>
-                <w:b w:val="0"/>
-                <w:sz w:val="18"/>
-              </w:rPr>
-              <w:t>제작비</w:t>
-            </w:r>
-          </w:p>
-        </w:tc>
-        <w:tc>
-          <w:tcPr>
-            <w:tcW w:type="dxa" w:w="1133"/>
-          </w:tcPr>
-          <w:p>
-            <w:pPr>
-              <w:jc w:val="left"/>
-            </w:pPr>
-            <w:r/>
-            <w:r>
-              <w:rPr>
-                <w:rFonts w:ascii="맑은 고딕" w:hAnsi="맑은 고딕" w:eastAsia="맑은 고딕"/>
-                <w:b w:val="0"/>
-                <w:sz w:val="18"/>
-              </w:rPr>
-              <w:t>포스터 수정비</w:t>
-            </w:r>
-          </w:p>
-        </w:tc>
-        <w:tc>
-          <w:tcPr>
-            <w:tcW w:type="dxa" w:w="1133"/>
-          </w:tcPr>
-          <w:p>
-            <w:pPr>
-              <w:jc w:val="center"/>
-            </w:pPr>
-            <w:r/>
-            <w:r>
-              <w:rPr>
-                <w:rFonts w:ascii="맑은 고딕" w:hAnsi="맑은 고딕" w:eastAsia="맑은 고딕"/>
-                <w:b w:val="0"/>
-                <w:sz w:val="18"/>
-              </w:rPr>
-              <w:t>식</w:t>
-            </w:r>
-          </w:p>
-        </w:tc>
-        <w:tc>
-          <w:tcPr>
-            <w:tcW w:type="dxa" w:w="1133"/>
-          </w:tcPr>
-          <w:p>
-            <w:pPr>
-              <w:jc w:val="center"/>
-            </w:pPr>
-            <w:r/>
-            <w:r>
-              <w:rPr>
-                <w:rFonts w:ascii="맑은 고딕" w:hAnsi="맑은 고딕" w:eastAsia="맑은 고딕"/>
-                <w:b w:val="0"/>
-                <w:sz w:val="18"/>
-              </w:rPr>
-              <w:t>1</w:t>
-            </w:r>
-          </w:p>
-        </w:tc>
-        <w:tc>
-          <w:tcPr>
-            <w:tcW w:type="dxa" w:w="1133"/>
-          </w:tcPr>
-          <w:p>
-            <w:pPr>
-              <w:jc w:val="right"/>
-            </w:pPr>
-            <w:r/>
-            <w:r>
-              <w:rPr>
-                <w:rFonts w:ascii="맑은 고딕" w:hAnsi="맑은 고딕" w:eastAsia="맑은 고딕"/>
-                <w:b w:val="0"/>
-                <w:sz w:val="18"/>
-              </w:rPr>
-            </w:r>
-          </w:p>
-        </w:tc>
-        <w:tc>
-          <w:tcPr>
-            <w:tcW w:type="dxa" w:w="1133"/>
-          </w:tcPr>
-          <w:p>
-            <w:pPr>
-              <w:jc w:val="right"/>
-            </w:pPr>
-            <w:r/>
-            <w:r>
-              <w:rPr>
-                <w:rFonts w:ascii="맑은 고딕" w:hAnsi="맑은 고딕" w:eastAsia="맑은 고딕"/>
-                <w:b w:val="0"/>
-                <w:sz w:val="18"/>
-              </w:rPr>
-            </w:r>
-          </w:p>
-        </w:tc>
-        <w:tc>
-          <w:tcPr>
-            <w:tcW w:type="dxa" w:w="1133"/>
-          </w:tcPr>
-          <w:p>
-            <w:pPr>
-              <w:jc w:val="center"/>
-            </w:pPr>
-            <w:r/>
-            <w:r>
-              <w:rPr>
-                <w:rFonts w:ascii="맑은 고딕" w:hAnsi="맑은 고딕" w:eastAsia="맑은 고딕"/>
-                <w:b w:val="0"/>
-                <w:sz w:val="18"/>
-              </w:rPr>
-              <w:t>홍보(용역사)</w:t>
-            </w:r>
-          </w:p>
-        </w:tc>
-        <w:tc>
-          <w:tcPr>
-            <w:tcW w:type="dxa" w:w="1133"/>
-          </w:tcPr>
-          <w:p>
-            <w:pPr>
-              <w:jc w:val="left"/>
-            </w:pPr>
-            <w:r/>
-            <w:r>
-              <w:rPr>
-                <w:rFonts w:ascii="맑은 고딕" w:hAnsi="맑은 고딕" w:eastAsia="맑은 고딕"/>
-                <w:b w:val="0"/>
-                <w:sz w:val="18"/>
-              </w:rPr>
-              <w:t>포스터 수정·편집</w:t>
-            </w:r>
-          </w:p>
-        </w:tc>
-      </w:tr>
-      <w:tr>
-        <w:tc>
-          <w:tcPr>
-            <w:tcW w:type="dxa" w:w="1133"/>
-            <w:shd w:val="clear" w:color="auto" w:fill="D9D9D9"/>
-          </w:tcPr>
-          <w:p>
-            <w:pPr>
-              <w:jc w:val="center"/>
-            </w:pPr>
-            <w:r/>
-            <w:r>
-              <w:rPr>
-                <w:rFonts w:ascii="맑은 고딕" w:hAnsi="맑은 고딕" w:eastAsia="맑은 고딕"/>
-                <w:b w:val="0"/>
-                <w:sz w:val="18"/>
-              </w:rPr>
-              <w:t>7</w:t>
             </w:r>
           </w:p>
         </w:tc>
@@ -1429,7 +569,7 @@
                 <w:b w:val="0"/>
                 <w:sz w:val="18"/>
               </w:rPr>
-              <w:t>기획·홍보(온나무 직접)</w:t>
+              <w:t>기획·홍보(온나무)</w:t>
             </w:r>
           </w:p>
         </w:tc>
@@ -1449,7 +589,893 @@
                 <w:b w:val="0"/>
                 <w:sz w:val="18"/>
               </w:rPr>
-              <w:t>초안 제작 내부 처리</w:t>
+              <w:t>초안 제작 내부 수행</w:t>
+            </w:r>
+          </w:p>
+        </w:tc>
+      </w:tr>
+      <w:tr>
+        <w:tc>
+          <w:tcPr>
+            <w:tcW w:type="dxa" w:w="1133"/>
+            <w:shd w:val="clear" w:color="auto" w:fill="D9D9D9"/>
+          </w:tcPr>
+          <w:p>
+            <w:pPr>
+              <w:jc w:val="center"/>
+            </w:pPr>
+            <w:r/>
+            <w:r>
+              <w:rPr>
+                <w:rFonts w:ascii="맑은 고딕" w:hAnsi="맑은 고딕" w:eastAsia="맑은 고딕"/>
+                <w:b w:val="0"/>
+                <w:sz w:val="18"/>
+              </w:rPr>
+              <w:t>3</w:t>
+            </w:r>
+          </w:p>
+        </w:tc>
+        <w:tc>
+          <w:tcPr>
+            <w:tcW w:type="dxa" w:w="1133"/>
+            <w:shd w:val="clear" w:color="auto" w:fill="D9D9D9"/>
+          </w:tcPr>
+          <w:p>
+            <w:pPr>
+              <w:jc w:val="center"/>
+            </w:pPr>
+            <w:r/>
+            <w:r>
+              <w:rPr>
+                <w:rFonts w:ascii="맑은 고딕" w:hAnsi="맑은 고딕" w:eastAsia="맑은 고딕"/>
+                <w:b w:val="0"/>
+                <w:sz w:val="18"/>
+              </w:rPr>
+              <w:t>제작비</w:t>
+            </w:r>
+          </w:p>
+        </w:tc>
+        <w:tc>
+          <w:tcPr>
+            <w:tcW w:type="dxa" w:w="1133"/>
+            <w:shd w:val="clear" w:color="auto" w:fill="D9D9D9"/>
+          </w:tcPr>
+          <w:p>
+            <w:pPr>
+              <w:jc w:val="left"/>
+            </w:pPr>
+            <w:r/>
+            <w:r>
+              <w:rPr>
+                <w:rFonts w:ascii="맑은 고딕" w:hAnsi="맑은 고딕" w:eastAsia="맑은 고딕"/>
+                <w:b w:val="0"/>
+                <w:sz w:val="18"/>
+              </w:rPr>
+              <w:t>SNS 초안 제작비</w:t>
+            </w:r>
+          </w:p>
+        </w:tc>
+        <w:tc>
+          <w:tcPr>
+            <w:tcW w:type="dxa" w:w="1133"/>
+            <w:shd w:val="clear" w:color="auto" w:fill="D9D9D9"/>
+          </w:tcPr>
+          <w:p>
+            <w:pPr>
+              <w:jc w:val="center"/>
+            </w:pPr>
+            <w:r/>
+            <w:r>
+              <w:rPr>
+                <w:rFonts w:ascii="맑은 고딕" w:hAnsi="맑은 고딕" w:eastAsia="맑은 고딕"/>
+                <w:b w:val="0"/>
+                <w:sz w:val="18"/>
+              </w:rPr>
+              <w:t>식</w:t>
+            </w:r>
+          </w:p>
+        </w:tc>
+        <w:tc>
+          <w:tcPr>
+            <w:tcW w:type="dxa" w:w="1133"/>
+            <w:shd w:val="clear" w:color="auto" w:fill="D9D9D9"/>
+          </w:tcPr>
+          <w:p>
+            <w:pPr>
+              <w:jc w:val="center"/>
+            </w:pPr>
+            <w:r/>
+            <w:r>
+              <w:rPr>
+                <w:rFonts w:ascii="맑은 고딕" w:hAnsi="맑은 고딕" w:eastAsia="맑은 고딕"/>
+                <w:b w:val="0"/>
+                <w:sz w:val="18"/>
+              </w:rPr>
+              <w:t>1</w:t>
+            </w:r>
+          </w:p>
+        </w:tc>
+        <w:tc>
+          <w:tcPr>
+            <w:tcW w:type="dxa" w:w="1133"/>
+            <w:shd w:val="clear" w:color="auto" w:fill="D9D9D9"/>
+          </w:tcPr>
+          <w:p>
+            <w:pPr>
+              <w:jc w:val="right"/>
+            </w:pPr>
+            <w:r/>
+            <w:r>
+              <w:rPr>
+                <w:rFonts w:ascii="맑은 고딕" w:hAnsi="맑은 고딕" w:eastAsia="맑은 고딕"/>
+                <w:b w:val="0"/>
+                <w:sz w:val="18"/>
+              </w:rPr>
+            </w:r>
+          </w:p>
+        </w:tc>
+        <w:tc>
+          <w:tcPr>
+            <w:tcW w:type="dxa" w:w="1133"/>
+            <w:shd w:val="clear" w:color="auto" w:fill="D9D9D9"/>
+          </w:tcPr>
+          <w:p>
+            <w:pPr>
+              <w:jc w:val="right"/>
+            </w:pPr>
+            <w:r/>
+            <w:r>
+              <w:rPr>
+                <w:rFonts w:ascii="맑은 고딕" w:hAnsi="맑은 고딕" w:eastAsia="맑은 고딕"/>
+                <w:b w:val="0"/>
+                <w:sz w:val="18"/>
+              </w:rPr>
+            </w:r>
+          </w:p>
+        </w:tc>
+        <w:tc>
+          <w:tcPr>
+            <w:tcW w:type="dxa" w:w="1133"/>
+            <w:shd w:val="clear" w:color="auto" w:fill="D9D9D9"/>
+          </w:tcPr>
+          <w:p>
+            <w:pPr>
+              <w:jc w:val="center"/>
+            </w:pPr>
+            <w:r/>
+            <w:r>
+              <w:rPr>
+                <w:rFonts w:ascii="맑은 고딕" w:hAnsi="맑은 고딕" w:eastAsia="맑은 고딕"/>
+                <w:b w:val="0"/>
+                <w:sz w:val="18"/>
+              </w:rPr>
+              <w:t>기획·홍보(온나무)</w:t>
+            </w:r>
+          </w:p>
+        </w:tc>
+        <w:tc>
+          <w:tcPr>
+            <w:tcW w:type="dxa" w:w="1133"/>
+            <w:shd w:val="clear" w:color="auto" w:fill="D9D9D9"/>
+          </w:tcPr>
+          <w:p>
+            <w:pPr>
+              <w:jc w:val="left"/>
+            </w:pPr>
+            <w:r/>
+            <w:r>
+              <w:rPr>
+                <w:rFonts w:ascii="맑은 고딕" w:hAnsi="맑은 고딕" w:eastAsia="맑은 고딕"/>
+                <w:b w:val="0"/>
+                <w:sz w:val="18"/>
+              </w:rPr>
+              <w:t>초안 제작 내부 수행</w:t>
+            </w:r>
+          </w:p>
+        </w:tc>
+      </w:tr>
+      <w:tr>
+        <w:tc>
+          <w:tcPr>
+            <w:tcW w:type="dxa" w:w="1133"/>
+            <w:shd w:val="clear" w:color="auto" w:fill="D9D9D9"/>
+          </w:tcPr>
+          <w:p>
+            <w:pPr>
+              <w:jc w:val="center"/>
+            </w:pPr>
+            <w:r/>
+            <w:r>
+              <w:rPr>
+                <w:rFonts w:ascii="맑은 고딕" w:hAnsi="맑은 고딕" w:eastAsia="맑은 고딕"/>
+                <w:b w:val="0"/>
+                <w:sz w:val="18"/>
+              </w:rPr>
+              <w:t>4</w:t>
+            </w:r>
+          </w:p>
+        </w:tc>
+        <w:tc>
+          <w:tcPr>
+            <w:tcW w:type="dxa" w:w="1133"/>
+            <w:shd w:val="clear" w:color="auto" w:fill="D9D9D9"/>
+          </w:tcPr>
+          <w:p>
+            <w:pPr>
+              <w:jc w:val="center"/>
+            </w:pPr>
+            <w:r/>
+            <w:r>
+              <w:rPr>
+                <w:rFonts w:ascii="맑은 고딕" w:hAnsi="맑은 고딕" w:eastAsia="맑은 고딕"/>
+                <w:b w:val="0"/>
+                <w:sz w:val="18"/>
+              </w:rPr>
+              <w:t>기획비</w:t>
+            </w:r>
+          </w:p>
+        </w:tc>
+        <w:tc>
+          <w:tcPr>
+            <w:tcW w:type="dxa" w:w="1133"/>
+            <w:shd w:val="clear" w:color="auto" w:fill="D9D9D9"/>
+          </w:tcPr>
+          <w:p>
+            <w:pPr>
+              <w:jc w:val="left"/>
+            </w:pPr>
+            <w:r/>
+            <w:r>
+              <w:rPr>
+                <w:rFonts w:ascii="맑은 고딕" w:hAnsi="맑은 고딕" w:eastAsia="맑은 고딕"/>
+                <w:b w:val="0"/>
+                <w:sz w:val="18"/>
+              </w:rPr>
+              <w:t>전체 계획 및 발주 획득 관리</w:t>
+            </w:r>
+          </w:p>
+        </w:tc>
+        <w:tc>
+          <w:tcPr>
+            <w:tcW w:type="dxa" w:w="1133"/>
+            <w:shd w:val="clear" w:color="auto" w:fill="D9D9D9"/>
+          </w:tcPr>
+          <w:p>
+            <w:pPr>
+              <w:jc w:val="center"/>
+            </w:pPr>
+            <w:r/>
+            <w:r>
+              <w:rPr>
+                <w:rFonts w:ascii="맑은 고딕" w:hAnsi="맑은 고딕" w:eastAsia="맑은 고딕"/>
+                <w:b w:val="0"/>
+                <w:sz w:val="18"/>
+              </w:rPr>
+              <w:t>식</w:t>
+            </w:r>
+          </w:p>
+        </w:tc>
+        <w:tc>
+          <w:tcPr>
+            <w:tcW w:type="dxa" w:w="1133"/>
+            <w:shd w:val="clear" w:color="auto" w:fill="D9D9D9"/>
+          </w:tcPr>
+          <w:p>
+            <w:pPr>
+              <w:jc w:val="center"/>
+            </w:pPr>
+            <w:r/>
+            <w:r>
+              <w:rPr>
+                <w:rFonts w:ascii="맑은 고딕" w:hAnsi="맑은 고딕" w:eastAsia="맑은 고딕"/>
+                <w:b w:val="0"/>
+                <w:sz w:val="18"/>
+              </w:rPr>
+              <w:t>1</w:t>
+            </w:r>
+          </w:p>
+        </w:tc>
+        <w:tc>
+          <w:tcPr>
+            <w:tcW w:type="dxa" w:w="1133"/>
+            <w:shd w:val="clear" w:color="auto" w:fill="D9D9D9"/>
+          </w:tcPr>
+          <w:p>
+            <w:pPr>
+              <w:jc w:val="right"/>
+            </w:pPr>
+            <w:r/>
+            <w:r>
+              <w:rPr>
+                <w:rFonts w:ascii="맑은 고딕" w:hAnsi="맑은 고딕" w:eastAsia="맑은 고딕"/>
+                <w:b w:val="0"/>
+                <w:sz w:val="18"/>
+              </w:rPr>
+            </w:r>
+          </w:p>
+        </w:tc>
+        <w:tc>
+          <w:tcPr>
+            <w:tcW w:type="dxa" w:w="1133"/>
+            <w:shd w:val="clear" w:color="auto" w:fill="D9D9D9"/>
+          </w:tcPr>
+          <w:p>
+            <w:pPr>
+              <w:jc w:val="right"/>
+            </w:pPr>
+            <w:r/>
+            <w:r>
+              <w:rPr>
+                <w:rFonts w:ascii="맑은 고딕" w:hAnsi="맑은 고딕" w:eastAsia="맑은 고딕"/>
+                <w:b w:val="0"/>
+                <w:sz w:val="18"/>
+              </w:rPr>
+            </w:r>
+          </w:p>
+        </w:tc>
+        <w:tc>
+          <w:tcPr>
+            <w:tcW w:type="dxa" w:w="1133"/>
+            <w:shd w:val="clear" w:color="auto" w:fill="D9D9D9"/>
+          </w:tcPr>
+          <w:p>
+            <w:pPr>
+              <w:jc w:val="center"/>
+            </w:pPr>
+            <w:r/>
+            <w:r>
+              <w:rPr>
+                <w:rFonts w:ascii="맑은 고딕" w:hAnsi="맑은 고딕" w:eastAsia="맑은 고딕"/>
+                <w:b w:val="0"/>
+                <w:sz w:val="18"/>
+              </w:rPr>
+              <w:t>기획팀(온나무)</w:t>
+            </w:r>
+          </w:p>
+        </w:tc>
+        <w:tc>
+          <w:tcPr>
+            <w:tcW w:type="dxa" w:w="1133"/>
+            <w:shd w:val="clear" w:color="auto" w:fill="D9D9D9"/>
+          </w:tcPr>
+          <w:p>
+            <w:pPr>
+              <w:jc w:val="left"/>
+            </w:pPr>
+            <w:r/>
+            <w:r>
+              <w:rPr>
+                <w:rFonts w:ascii="맑은 고딕" w:hAnsi="맑은 고딕" w:eastAsia="맑은 고딕"/>
+                <w:b w:val="0"/>
+                <w:sz w:val="18"/>
+              </w:rPr>
+              <w:t>총괄 기획·발주 관리</w:t>
+            </w:r>
+          </w:p>
+        </w:tc>
+      </w:tr>
+      <w:tr>
+        <w:tc>
+          <w:tcPr>
+            <w:tcW w:type="dxa" w:w="1133"/>
+            <w:shd w:val="clear" w:color="auto" w:fill="D9D9D9"/>
+          </w:tcPr>
+          <w:p>
+            <w:pPr>
+              <w:jc w:val="center"/>
+            </w:pPr>
+            <w:r/>
+            <w:r>
+              <w:rPr>
+                <w:rFonts w:ascii="맑은 고딕" w:hAnsi="맑은 고딕" w:eastAsia="맑은 고딕"/>
+                <w:b w:val="0"/>
+                <w:sz w:val="18"/>
+              </w:rPr>
+              <w:t>5</w:t>
+            </w:r>
+          </w:p>
+        </w:tc>
+        <w:tc>
+          <w:tcPr>
+            <w:tcW w:type="dxa" w:w="1133"/>
+            <w:shd w:val="clear" w:color="auto" w:fill="D9D9D9"/>
+          </w:tcPr>
+          <w:p>
+            <w:pPr>
+              <w:jc w:val="center"/>
+            </w:pPr>
+            <w:r/>
+            <w:r>
+              <w:rPr>
+                <w:rFonts w:ascii="맑은 고딕" w:hAnsi="맑은 고딕" w:eastAsia="맑은 고딕"/>
+                <w:b w:val="0"/>
+                <w:sz w:val="18"/>
+              </w:rPr>
+              <w:t>보고</w:t>
+            </w:r>
+          </w:p>
+        </w:tc>
+        <w:tc>
+          <w:tcPr>
+            <w:tcW w:type="dxa" w:w="1133"/>
+            <w:shd w:val="clear" w:color="auto" w:fill="D9D9D9"/>
+          </w:tcPr>
+          <w:p>
+            <w:pPr>
+              <w:jc w:val="left"/>
+            </w:pPr>
+            <w:r/>
+            <w:r>
+              <w:rPr>
+                <w:rFonts w:ascii="맑은 고딕" w:hAnsi="맑은 고딕" w:eastAsia="맑은 고딕"/>
+                <w:b w:val="0"/>
+                <w:sz w:val="18"/>
+              </w:rPr>
+              <w:t>결과보고서 작성 완성</w:t>
+            </w:r>
+          </w:p>
+        </w:tc>
+        <w:tc>
+          <w:tcPr>
+            <w:tcW w:type="dxa" w:w="1133"/>
+            <w:shd w:val="clear" w:color="auto" w:fill="D9D9D9"/>
+          </w:tcPr>
+          <w:p>
+            <w:pPr>
+              <w:jc w:val="center"/>
+            </w:pPr>
+            <w:r/>
+            <w:r>
+              <w:rPr>
+                <w:rFonts w:ascii="맑은 고딕" w:hAnsi="맑은 고딕" w:eastAsia="맑은 고딕"/>
+                <w:b w:val="0"/>
+                <w:sz w:val="18"/>
+              </w:rPr>
+              <w:t>식</w:t>
+            </w:r>
+          </w:p>
+        </w:tc>
+        <w:tc>
+          <w:tcPr>
+            <w:tcW w:type="dxa" w:w="1133"/>
+            <w:shd w:val="clear" w:color="auto" w:fill="D9D9D9"/>
+          </w:tcPr>
+          <w:p>
+            <w:pPr>
+              <w:jc w:val="center"/>
+            </w:pPr>
+            <w:r/>
+            <w:r>
+              <w:rPr>
+                <w:rFonts w:ascii="맑은 고딕" w:hAnsi="맑은 고딕" w:eastAsia="맑은 고딕"/>
+                <w:b w:val="0"/>
+                <w:sz w:val="18"/>
+              </w:rPr>
+              <w:t>1</w:t>
+            </w:r>
+          </w:p>
+        </w:tc>
+        <w:tc>
+          <w:tcPr>
+            <w:tcW w:type="dxa" w:w="1133"/>
+            <w:shd w:val="clear" w:color="auto" w:fill="D9D9D9"/>
+          </w:tcPr>
+          <w:p>
+            <w:pPr>
+              <w:jc w:val="right"/>
+            </w:pPr>
+            <w:r/>
+            <w:r>
+              <w:rPr>
+                <w:rFonts w:ascii="맑은 고딕" w:hAnsi="맑은 고딕" w:eastAsia="맑은 고딕"/>
+                <w:b w:val="0"/>
+                <w:sz w:val="18"/>
+              </w:rPr>
+            </w:r>
+          </w:p>
+        </w:tc>
+        <w:tc>
+          <w:tcPr>
+            <w:tcW w:type="dxa" w:w="1133"/>
+            <w:shd w:val="clear" w:color="auto" w:fill="D9D9D9"/>
+          </w:tcPr>
+          <w:p>
+            <w:pPr>
+              <w:jc w:val="right"/>
+            </w:pPr>
+            <w:r/>
+            <w:r>
+              <w:rPr>
+                <w:rFonts w:ascii="맑은 고딕" w:hAnsi="맑은 고딕" w:eastAsia="맑은 고딕"/>
+                <w:b w:val="0"/>
+                <w:sz w:val="18"/>
+              </w:rPr>
+            </w:r>
+          </w:p>
+        </w:tc>
+        <w:tc>
+          <w:tcPr>
+            <w:tcW w:type="dxa" w:w="1133"/>
+            <w:shd w:val="clear" w:color="auto" w:fill="D9D9D9"/>
+          </w:tcPr>
+          <w:p>
+            <w:pPr>
+              <w:jc w:val="center"/>
+            </w:pPr>
+            <w:r/>
+            <w:r>
+              <w:rPr>
+                <w:rFonts w:ascii="맑은 고딕" w:hAnsi="맑은 고딕" w:eastAsia="맑은 고딕"/>
+                <w:b w:val="0"/>
+                <w:sz w:val="18"/>
+              </w:rPr>
+              <w:t>기획팀(온나무)</w:t>
+            </w:r>
+          </w:p>
+        </w:tc>
+        <w:tc>
+          <w:tcPr>
+            <w:tcW w:type="dxa" w:w="1133"/>
+            <w:shd w:val="clear" w:color="auto" w:fill="D9D9D9"/>
+          </w:tcPr>
+          <w:p>
+            <w:pPr>
+              <w:jc w:val="left"/>
+            </w:pPr>
+            <w:r/>
+            <w:r>
+              <w:rPr>
+                <w:rFonts w:ascii="맑은 고딕" w:hAnsi="맑은 고딕" w:eastAsia="맑은 고딕"/>
+                <w:b w:val="0"/>
+                <w:sz w:val="18"/>
+              </w:rPr>
+              <w:t>최종 보고서 완성</w:t>
+            </w:r>
+          </w:p>
+        </w:tc>
+      </w:tr>
+      <w:tr>
+        <w:tc>
+          <w:tcPr>
+            <w:tcW w:type="dxa" w:w="1133"/>
+          </w:tcPr>
+          <w:p>
+            <w:pPr>
+              <w:jc w:val="center"/>
+            </w:pPr>
+            <w:r/>
+            <w:r>
+              <w:rPr>
+                <w:rFonts w:ascii="맑은 고딕" w:hAnsi="맑은 고딕" w:eastAsia="맑은 고딕"/>
+                <w:b w:val="0"/>
+                <w:sz w:val="18"/>
+              </w:rPr>
+              <w:t>6</w:t>
+            </w:r>
+          </w:p>
+        </w:tc>
+        <w:tc>
+          <w:tcPr>
+            <w:tcW w:type="dxa" w:w="1133"/>
+          </w:tcPr>
+          <w:p>
+            <w:pPr>
+              <w:jc w:val="center"/>
+            </w:pPr>
+            <w:r/>
+            <w:r>
+              <w:rPr>
+                <w:rFonts w:ascii="맑은 고딕" w:hAnsi="맑은 고딕" w:eastAsia="맑은 고딕"/>
+                <w:b w:val="0"/>
+                <w:sz w:val="18"/>
+              </w:rPr>
+              <w:t>인건비</w:t>
+            </w:r>
+          </w:p>
+        </w:tc>
+        <w:tc>
+          <w:tcPr>
+            <w:tcW w:type="dxa" w:w="1133"/>
+          </w:tcPr>
+          <w:p>
+            <w:pPr>
+              <w:jc w:val="left"/>
+            </w:pPr>
+            <w:r/>
+            <w:r>
+              <w:rPr>
+                <w:rFonts w:ascii="맑은 고딕" w:hAnsi="맑은 고딕" w:eastAsia="맑은 고딕"/>
+                <w:b w:val="0"/>
+                <w:sz w:val="18"/>
+              </w:rPr>
+              <w:t>사회진행비</w:t>
+            </w:r>
+          </w:p>
+        </w:tc>
+        <w:tc>
+          <w:tcPr>
+            <w:tcW w:type="dxa" w:w="1133"/>
+          </w:tcPr>
+          <w:p>
+            <w:pPr>
+              <w:jc w:val="center"/>
+            </w:pPr>
+            <w:r/>
+            <w:r>
+              <w:rPr>
+                <w:rFonts w:ascii="맑은 고딕" w:hAnsi="맑은 고딕" w:eastAsia="맑은 고딕"/>
+                <w:b w:val="0"/>
+                <w:sz w:val="18"/>
+              </w:rPr>
+              <w:t>회</w:t>
+            </w:r>
+          </w:p>
+        </w:tc>
+        <w:tc>
+          <w:tcPr>
+            <w:tcW w:type="dxa" w:w="1133"/>
+          </w:tcPr>
+          <w:p>
+            <w:pPr>
+              <w:jc w:val="center"/>
+            </w:pPr>
+            <w:r/>
+            <w:r>
+              <w:rPr>
+                <w:rFonts w:ascii="맑은 고딕" w:hAnsi="맑은 고딕" w:eastAsia="맑은 고딕"/>
+                <w:b w:val="0"/>
+                <w:sz w:val="18"/>
+              </w:rPr>
+              <w:t>6</w:t>
+            </w:r>
+          </w:p>
+        </w:tc>
+        <w:tc>
+          <w:tcPr>
+            <w:tcW w:type="dxa" w:w="1133"/>
+          </w:tcPr>
+          <w:p>
+            <w:pPr>
+              <w:jc w:val="right"/>
+            </w:pPr>
+            <w:r/>
+            <w:r>
+              <w:rPr>
+                <w:rFonts w:ascii="맑은 고딕" w:hAnsi="맑은 고딕" w:eastAsia="맑은 고딕"/>
+                <w:b w:val="0"/>
+                <w:sz w:val="18"/>
+              </w:rPr>
+              <w:t>200,000</w:t>
+            </w:r>
+          </w:p>
+        </w:tc>
+        <w:tc>
+          <w:tcPr>
+            <w:tcW w:type="dxa" w:w="1133"/>
+          </w:tcPr>
+          <w:p>
+            <w:pPr>
+              <w:jc w:val="right"/>
+            </w:pPr>
+            <w:r/>
+            <w:r>
+              <w:rPr>
+                <w:rFonts w:ascii="맑은 고딕" w:hAnsi="맑은 고딕" w:eastAsia="맑은 고딕"/>
+                <w:b w:val="0"/>
+                <w:sz w:val="18"/>
+              </w:rPr>
+              <w:t>1,200,000</w:t>
+            </w:r>
+          </w:p>
+        </w:tc>
+        <w:tc>
+          <w:tcPr>
+            <w:tcW w:type="dxa" w:w="1133"/>
+          </w:tcPr>
+          <w:p>
+            <w:pPr>
+              <w:jc w:val="center"/>
+            </w:pPr>
+            <w:r/>
+            <w:r>
+              <w:rPr>
+                <w:rFonts w:ascii="맑은 고딕" w:hAnsi="맑은 고딕" w:eastAsia="맑은 고딕"/>
+                <w:b w:val="0"/>
+                <w:sz w:val="18"/>
+              </w:rPr>
+              <w:t>현장운영(사회자)</w:t>
+            </w:r>
+          </w:p>
+        </w:tc>
+        <w:tc>
+          <w:tcPr>
+            <w:tcW w:type="dxa" w:w="1133"/>
+          </w:tcPr>
+          <w:p>
+            <w:pPr>
+              <w:jc w:val="left"/>
+            </w:pPr>
+            <w:r/>
+            <w:r>
+              <w:rPr>
+                <w:rFonts w:ascii="맑은 고딕" w:hAnsi="맑은 고딕" w:eastAsia="맑은 고딕"/>
+                <w:b w:val="0"/>
+                <w:sz w:val="18"/>
+              </w:rPr>
+              <w:t>사회자 교통비 포함</w:t>
+            </w:r>
+          </w:p>
+        </w:tc>
+      </w:tr>
+      <w:tr>
+        <w:tc>
+          <w:tcPr>
+            <w:tcW w:type="dxa" w:w="1133"/>
+          </w:tcPr>
+          <w:p>
+            <w:pPr>
+              <w:jc w:val="center"/>
+            </w:pPr>
+            <w:r/>
+            <w:r>
+              <w:rPr>
+                <w:rFonts w:ascii="맑은 고딕" w:hAnsi="맑은 고딕" w:eastAsia="맑은 고딕"/>
+                <w:b w:val="0"/>
+                <w:sz w:val="18"/>
+              </w:rPr>
+              <w:t>7</w:t>
+            </w:r>
+          </w:p>
+        </w:tc>
+        <w:tc>
+          <w:tcPr>
+            <w:tcW w:type="dxa" w:w="1133"/>
+          </w:tcPr>
+          <w:p>
+            <w:pPr>
+              <w:jc w:val="center"/>
+            </w:pPr>
+            <w:r/>
+            <w:r>
+              <w:rPr>
+                <w:rFonts w:ascii="맑은 고딕" w:hAnsi="맑은 고딕" w:eastAsia="맑은 고딕"/>
+                <w:b w:val="0"/>
+                <w:sz w:val="18"/>
+              </w:rPr>
+              <w:t>제작비</w:t>
+            </w:r>
+          </w:p>
+        </w:tc>
+        <w:tc>
+          <w:tcPr>
+            <w:tcW w:type="dxa" w:w="1133"/>
+          </w:tcPr>
+          <w:p>
+            <w:pPr>
+              <w:jc w:val="left"/>
+            </w:pPr>
+            <w:r/>
+            <w:r>
+              <w:rPr>
+                <w:rFonts w:ascii="맑은 고딕" w:hAnsi="맑은 고딕" w:eastAsia="맑은 고딕"/>
+                <w:b w:val="0"/>
+                <w:sz w:val="18"/>
+              </w:rPr>
+              <w:t>행사 사진·영상 촬영 및 편집</w:t>
+            </w:r>
+          </w:p>
+        </w:tc>
+        <w:tc>
+          <w:tcPr>
+            <w:tcW w:type="dxa" w:w="1133"/>
+          </w:tcPr>
+          <w:p>
+            <w:pPr>
+              <w:jc w:val="center"/>
+            </w:pPr>
+            <w:r/>
+            <w:r>
+              <w:rPr>
+                <w:rFonts w:ascii="맑은 고딕" w:hAnsi="맑은 고딕" w:eastAsia="맑은 고딕"/>
+                <w:b w:val="0"/>
+                <w:sz w:val="18"/>
+              </w:rPr>
+              <w:t>식</w:t>
+            </w:r>
+          </w:p>
+        </w:tc>
+        <w:tc>
+          <w:tcPr>
+            <w:tcW w:type="dxa" w:w="1133"/>
+          </w:tcPr>
+          <w:p>
+            <w:pPr>
+              <w:jc w:val="center"/>
+            </w:pPr>
+            <w:r/>
+            <w:r>
+              <w:rPr>
+                <w:rFonts w:ascii="맑은 고딕" w:hAnsi="맑은 고딕" w:eastAsia="맑은 고딕"/>
+                <w:b w:val="0"/>
+                <w:sz w:val="18"/>
+              </w:rPr>
+              <w:t>1</w:t>
+            </w:r>
+          </w:p>
+        </w:tc>
+        <w:tc>
+          <w:tcPr>
+            <w:tcW w:type="dxa" w:w="1133"/>
+          </w:tcPr>
+          <w:p>
+            <w:pPr>
+              <w:jc w:val="right"/>
+            </w:pPr>
+            <w:r/>
+            <w:r>
+              <w:rPr>
+                <w:rFonts w:ascii="맑은 고딕" w:hAnsi="맑은 고딕" w:eastAsia="맑은 고딕"/>
+                <w:b w:val="0"/>
+                <w:sz w:val="18"/>
+              </w:rPr>
+              <w:t>1,500,000</w:t>
+            </w:r>
+          </w:p>
+        </w:tc>
+        <w:tc>
+          <w:tcPr>
+            <w:tcW w:type="dxa" w:w="1133"/>
+          </w:tcPr>
+          <w:p>
+            <w:pPr>
+              <w:jc w:val="right"/>
+            </w:pPr>
+            <w:r/>
+            <w:r>
+              <w:rPr>
+                <w:rFonts w:ascii="맑은 고딕" w:hAnsi="맑은 고딕" w:eastAsia="맑은 고딕"/>
+                <w:b w:val="0"/>
+                <w:sz w:val="18"/>
+              </w:rPr>
+              <w:t>1,500,000</w:t>
+            </w:r>
+          </w:p>
+        </w:tc>
+        <w:tc>
+          <w:tcPr>
+            <w:tcW w:type="dxa" w:w="1133"/>
+          </w:tcPr>
+          <w:p>
+            <w:pPr>
+              <w:jc w:val="center"/>
+            </w:pPr>
+            <w:r/>
+            <w:r>
+              <w:rPr>
+                <w:rFonts w:ascii="맑은 고딕" w:hAnsi="맑은 고딕" w:eastAsia="맑은 고딕"/>
+                <w:b w:val="0"/>
+                <w:sz w:val="18"/>
+              </w:rPr>
+              <w:t>행정·운영지원(영상)</w:t>
+            </w:r>
+          </w:p>
+        </w:tc>
+        <w:tc>
+          <w:tcPr>
+            <w:tcW w:type="dxa" w:w="1133"/>
+          </w:tcPr>
+          <w:p>
+            <w:pPr>
+              <w:jc w:val="left"/>
+            </w:pPr>
+            <w:r/>
+            <w:r>
+              <w:rPr>
+                <w:rFonts w:ascii="맑은 고딕" w:hAnsi="맑은 고딕" w:eastAsia="맑은 고딕"/>
+                <w:b w:val="0"/>
+                <w:sz w:val="18"/>
+              </w:rPr>
+              <w:t>최종 결과물 1EA</w:t>
             </w:r>
           </w:p>
         </w:tc>
@@ -1471,6 +1497,524 @@
                 <w:sz w:val="18"/>
               </w:rPr>
               <w:t>8</w:t>
+            </w:r>
+          </w:p>
+        </w:tc>
+        <w:tc>
+          <w:tcPr>
+            <w:tcW w:type="dxa" w:w="1133"/>
+          </w:tcPr>
+          <w:p>
+            <w:pPr>
+              <w:jc w:val="center"/>
+            </w:pPr>
+            <w:r/>
+            <w:r>
+              <w:rPr>
+                <w:rFonts w:ascii="맑은 고딕" w:hAnsi="맑은 고딕" w:eastAsia="맑은 고딕"/>
+                <w:b w:val="0"/>
+                <w:sz w:val="18"/>
+              </w:rPr>
+              <w:t>인쇄비</w:t>
+            </w:r>
+          </w:p>
+        </w:tc>
+        <w:tc>
+          <w:tcPr>
+            <w:tcW w:type="dxa" w:w="1133"/>
+          </w:tcPr>
+          <w:p>
+            <w:pPr>
+              <w:jc w:val="left"/>
+            </w:pPr>
+            <w:r/>
+            <w:r>
+              <w:rPr>
+                <w:rFonts w:ascii="맑은 고딕" w:hAnsi="맑은 고딕" w:eastAsia="맑은 고딕"/>
+                <w:b w:val="0"/>
+                <w:sz w:val="18"/>
+              </w:rPr>
+              <w:t>강연자료집 제작 및 인쇄</w:t>
+            </w:r>
+          </w:p>
+        </w:tc>
+        <w:tc>
+          <w:tcPr>
+            <w:tcW w:type="dxa" w:w="1133"/>
+          </w:tcPr>
+          <w:p>
+            <w:pPr>
+              <w:jc w:val="center"/>
+            </w:pPr>
+            <w:r/>
+            <w:r>
+              <w:rPr>
+                <w:rFonts w:ascii="맑은 고딕" w:hAnsi="맑은 고딕" w:eastAsia="맑은 고딕"/>
+                <w:b w:val="0"/>
+                <w:sz w:val="18"/>
+              </w:rPr>
+              <w:t>식</w:t>
+            </w:r>
+          </w:p>
+        </w:tc>
+        <w:tc>
+          <w:tcPr>
+            <w:tcW w:type="dxa" w:w="1133"/>
+          </w:tcPr>
+          <w:p>
+            <w:pPr>
+              <w:jc w:val="center"/>
+            </w:pPr>
+            <w:r/>
+            <w:r>
+              <w:rPr>
+                <w:rFonts w:ascii="맑은 고딕" w:hAnsi="맑은 고딕" w:eastAsia="맑은 고딕"/>
+                <w:b w:val="0"/>
+                <w:sz w:val="18"/>
+              </w:rPr>
+              <w:t>1</w:t>
+            </w:r>
+          </w:p>
+        </w:tc>
+        <w:tc>
+          <w:tcPr>
+            <w:tcW w:type="dxa" w:w="1133"/>
+          </w:tcPr>
+          <w:p>
+            <w:pPr>
+              <w:jc w:val="right"/>
+            </w:pPr>
+            <w:r/>
+            <w:r>
+              <w:rPr>
+                <w:rFonts w:ascii="맑은 고딕" w:hAnsi="맑은 고딕" w:eastAsia="맑은 고딕"/>
+                <w:b w:val="0"/>
+                <w:sz w:val="18"/>
+              </w:rPr>
+              <w:t>1,000,000</w:t>
+            </w:r>
+          </w:p>
+        </w:tc>
+        <w:tc>
+          <w:tcPr>
+            <w:tcW w:type="dxa" w:w="1133"/>
+          </w:tcPr>
+          <w:p>
+            <w:pPr>
+              <w:jc w:val="right"/>
+            </w:pPr>
+            <w:r/>
+            <w:r>
+              <w:rPr>
+                <w:rFonts w:ascii="맑은 고딕" w:hAnsi="맑은 고딕" w:eastAsia="맑은 고딕"/>
+                <w:b w:val="0"/>
+                <w:sz w:val="18"/>
+              </w:rPr>
+              <w:t>1,000,000</w:t>
+            </w:r>
+          </w:p>
+        </w:tc>
+        <w:tc>
+          <w:tcPr>
+            <w:tcW w:type="dxa" w:w="1133"/>
+          </w:tcPr>
+          <w:p>
+            <w:pPr>
+              <w:jc w:val="center"/>
+            </w:pPr>
+            <w:r/>
+            <w:r>
+              <w:rPr>
+                <w:rFonts w:ascii="맑은 고딕" w:hAnsi="맑은 고딕" w:eastAsia="맑은 고딕"/>
+                <w:b w:val="0"/>
+                <w:sz w:val="18"/>
+              </w:rPr>
+              <w:t>제작·인쇄(용역사)</w:t>
+            </w:r>
+          </w:p>
+        </w:tc>
+        <w:tc>
+          <w:tcPr>
+            <w:tcW w:type="dxa" w:w="1133"/>
+          </w:tcPr>
+          <w:p>
+            <w:pPr>
+              <w:jc w:val="left"/>
+            </w:pPr>
+            <w:r/>
+            <w:r>
+              <w:rPr>
+                <w:rFonts w:ascii="맑은 고딕" w:hAnsi="맑은 고딕" w:eastAsia="맑은 고딕"/>
+                <w:b w:val="0"/>
+                <w:sz w:val="18"/>
+              </w:rPr>
+            </w:r>
+          </w:p>
+        </w:tc>
+      </w:tr>
+      <w:tr>
+        <w:tc>
+          <w:tcPr>
+            <w:tcW w:type="dxa" w:w="1133"/>
+          </w:tcPr>
+          <w:p>
+            <w:pPr>
+              <w:jc w:val="center"/>
+            </w:pPr>
+            <w:r/>
+            <w:r>
+              <w:rPr>
+                <w:rFonts w:ascii="맑은 고딕" w:hAnsi="맑은 고딕" w:eastAsia="맑은 고딕"/>
+                <w:b w:val="0"/>
+                <w:sz w:val="18"/>
+              </w:rPr>
+              <w:t>9</w:t>
+            </w:r>
+          </w:p>
+        </w:tc>
+        <w:tc>
+          <w:tcPr>
+            <w:tcW w:type="dxa" w:w="1133"/>
+          </w:tcPr>
+          <w:p>
+            <w:pPr>
+              <w:jc w:val="center"/>
+            </w:pPr>
+            <w:r/>
+            <w:r>
+              <w:rPr>
+                <w:rFonts w:ascii="맑은 고딕" w:hAnsi="맑은 고딕" w:eastAsia="맑은 고딕"/>
+                <w:b w:val="0"/>
+                <w:sz w:val="18"/>
+              </w:rPr>
+              <w:t>제작비</w:t>
+            </w:r>
+          </w:p>
+        </w:tc>
+        <w:tc>
+          <w:tcPr>
+            <w:tcW w:type="dxa" w:w="1133"/>
+          </w:tcPr>
+          <w:p>
+            <w:pPr>
+              <w:jc w:val="left"/>
+            </w:pPr>
+            <w:r/>
+            <w:r>
+              <w:rPr>
+                <w:rFonts w:ascii="맑은 고딕" w:hAnsi="맑은 고딕" w:eastAsia="맑은 고딕"/>
+                <w:b w:val="0"/>
+                <w:sz w:val="18"/>
+              </w:rPr>
+              <w:t>SNS 제작비</w:t>
+            </w:r>
+          </w:p>
+        </w:tc>
+        <w:tc>
+          <w:tcPr>
+            <w:tcW w:type="dxa" w:w="1133"/>
+          </w:tcPr>
+          <w:p>
+            <w:pPr>
+              <w:jc w:val="center"/>
+            </w:pPr>
+            <w:r/>
+            <w:r>
+              <w:rPr>
+                <w:rFonts w:ascii="맑은 고딕" w:hAnsi="맑은 고딕" w:eastAsia="맑은 고딕"/>
+                <w:b w:val="0"/>
+                <w:sz w:val="18"/>
+              </w:rPr>
+              <w:t>식</w:t>
+            </w:r>
+          </w:p>
+        </w:tc>
+        <w:tc>
+          <w:tcPr>
+            <w:tcW w:type="dxa" w:w="1133"/>
+          </w:tcPr>
+          <w:p>
+            <w:pPr>
+              <w:jc w:val="center"/>
+            </w:pPr>
+            <w:r/>
+            <w:r>
+              <w:rPr>
+                <w:rFonts w:ascii="맑은 고딕" w:hAnsi="맑은 고딕" w:eastAsia="맑은 고딕"/>
+                <w:b w:val="0"/>
+                <w:sz w:val="18"/>
+              </w:rPr>
+              <w:t>1</w:t>
+            </w:r>
+          </w:p>
+        </w:tc>
+        <w:tc>
+          <w:tcPr>
+            <w:tcW w:type="dxa" w:w="1133"/>
+          </w:tcPr>
+          <w:p>
+            <w:pPr>
+              <w:jc w:val="right"/>
+            </w:pPr>
+            <w:r/>
+            <w:r>
+              <w:rPr>
+                <w:rFonts w:ascii="맑은 고딕" w:hAnsi="맑은 고딕" w:eastAsia="맑은 고딕"/>
+                <w:b w:val="0"/>
+                <w:sz w:val="18"/>
+              </w:rPr>
+              <w:t>400,000</w:t>
+            </w:r>
+          </w:p>
+        </w:tc>
+        <w:tc>
+          <w:tcPr>
+            <w:tcW w:type="dxa" w:w="1133"/>
+          </w:tcPr>
+          <w:p>
+            <w:pPr>
+              <w:jc w:val="right"/>
+            </w:pPr>
+            <w:r/>
+            <w:r>
+              <w:rPr>
+                <w:rFonts w:ascii="맑은 고딕" w:hAnsi="맑은 고딕" w:eastAsia="맑은 고딕"/>
+                <w:b w:val="0"/>
+                <w:sz w:val="18"/>
+              </w:rPr>
+              <w:t>400,000</w:t>
+            </w:r>
+          </w:p>
+        </w:tc>
+        <w:tc>
+          <w:tcPr>
+            <w:tcW w:type="dxa" w:w="1133"/>
+          </w:tcPr>
+          <w:p>
+            <w:pPr>
+              <w:jc w:val="center"/>
+            </w:pPr>
+            <w:r/>
+            <w:r>
+              <w:rPr>
+                <w:rFonts w:ascii="맑은 고딕" w:hAnsi="맑은 고딕" w:eastAsia="맑은 고딕"/>
+                <w:b w:val="0"/>
+                <w:sz w:val="18"/>
+              </w:rPr>
+              <w:t>홍보(용역사)</w:t>
+            </w:r>
+          </w:p>
+        </w:tc>
+        <w:tc>
+          <w:tcPr>
+            <w:tcW w:type="dxa" w:w="1133"/>
+          </w:tcPr>
+          <w:p>
+            <w:pPr>
+              <w:jc w:val="left"/>
+            </w:pPr>
+            <w:r/>
+            <w:r>
+              <w:rPr>
+                <w:rFonts w:ascii="맑은 고딕" w:hAnsi="맑은 고딕" w:eastAsia="맑은 고딕"/>
+                <w:b w:val="0"/>
+                <w:sz w:val="18"/>
+              </w:rPr>
+              <w:t>SNS 게시물 제작</w:t>
+            </w:r>
+          </w:p>
+        </w:tc>
+      </w:tr>
+      <w:tr>
+        <w:tc>
+          <w:tcPr>
+            <w:tcW w:type="dxa" w:w="1133"/>
+          </w:tcPr>
+          <w:p>
+            <w:pPr>
+              <w:jc w:val="center"/>
+            </w:pPr>
+            <w:r/>
+            <w:r>
+              <w:rPr>
+                <w:rFonts w:ascii="맑은 고딕" w:hAnsi="맑은 고딕" w:eastAsia="맑은 고딕"/>
+                <w:b w:val="0"/>
+                <w:sz w:val="18"/>
+              </w:rPr>
+              <w:t>10</w:t>
+            </w:r>
+          </w:p>
+        </w:tc>
+        <w:tc>
+          <w:tcPr>
+            <w:tcW w:type="dxa" w:w="1133"/>
+          </w:tcPr>
+          <w:p>
+            <w:pPr>
+              <w:jc w:val="center"/>
+            </w:pPr>
+            <w:r/>
+            <w:r>
+              <w:rPr>
+                <w:rFonts w:ascii="맑은 고딕" w:hAnsi="맑은 고딕" w:eastAsia="맑은 고딕"/>
+                <w:b w:val="0"/>
+                <w:sz w:val="18"/>
+              </w:rPr>
+              <w:t>제작비</w:t>
+            </w:r>
+          </w:p>
+        </w:tc>
+        <w:tc>
+          <w:tcPr>
+            <w:tcW w:type="dxa" w:w="1133"/>
+          </w:tcPr>
+          <w:p>
+            <w:pPr>
+              <w:jc w:val="left"/>
+            </w:pPr>
+            <w:r/>
+            <w:r>
+              <w:rPr>
+                <w:rFonts w:ascii="맑은 고딕" w:hAnsi="맑은 고딕" w:eastAsia="맑은 고딕"/>
+                <w:b w:val="0"/>
+                <w:sz w:val="18"/>
+              </w:rPr>
+              <w:t>포스터 수정비</w:t>
+            </w:r>
+          </w:p>
+        </w:tc>
+        <w:tc>
+          <w:tcPr>
+            <w:tcW w:type="dxa" w:w="1133"/>
+          </w:tcPr>
+          <w:p>
+            <w:pPr>
+              <w:jc w:val="center"/>
+            </w:pPr>
+            <w:r/>
+            <w:r>
+              <w:rPr>
+                <w:rFonts w:ascii="맑은 고딕" w:hAnsi="맑은 고딕" w:eastAsia="맑은 고딕"/>
+                <w:b w:val="0"/>
+                <w:sz w:val="18"/>
+              </w:rPr>
+              <w:t>식</w:t>
+            </w:r>
+          </w:p>
+        </w:tc>
+        <w:tc>
+          <w:tcPr>
+            <w:tcW w:type="dxa" w:w="1133"/>
+          </w:tcPr>
+          <w:p>
+            <w:pPr>
+              <w:jc w:val="center"/>
+            </w:pPr>
+            <w:r/>
+            <w:r>
+              <w:rPr>
+                <w:rFonts w:ascii="맑은 고딕" w:hAnsi="맑은 고딕" w:eastAsia="맑은 고딕"/>
+                <w:b w:val="0"/>
+                <w:sz w:val="18"/>
+              </w:rPr>
+              <w:t>1</w:t>
+            </w:r>
+          </w:p>
+        </w:tc>
+        <w:tc>
+          <w:tcPr>
+            <w:tcW w:type="dxa" w:w="1133"/>
+          </w:tcPr>
+          <w:p>
+            <w:pPr>
+              <w:jc w:val="right"/>
+            </w:pPr>
+            <w:r/>
+            <w:r>
+              <w:rPr>
+                <w:rFonts w:ascii="맑은 고딕" w:hAnsi="맑은 고딕" w:eastAsia="맑은 고딕"/>
+                <w:b w:val="0"/>
+                <w:sz w:val="18"/>
+              </w:rPr>
+              <w:t>300,000</w:t>
+            </w:r>
+          </w:p>
+        </w:tc>
+        <w:tc>
+          <w:tcPr>
+            <w:tcW w:type="dxa" w:w="1133"/>
+          </w:tcPr>
+          <w:p>
+            <w:pPr>
+              <w:jc w:val="right"/>
+            </w:pPr>
+            <w:r/>
+            <w:r>
+              <w:rPr>
+                <w:rFonts w:ascii="맑은 고딕" w:hAnsi="맑은 고딕" w:eastAsia="맑은 고딕"/>
+                <w:b w:val="0"/>
+                <w:sz w:val="18"/>
+              </w:rPr>
+              <w:t>300,000</w:t>
+            </w:r>
+          </w:p>
+        </w:tc>
+        <w:tc>
+          <w:tcPr>
+            <w:tcW w:type="dxa" w:w="1133"/>
+          </w:tcPr>
+          <w:p>
+            <w:pPr>
+              <w:jc w:val="center"/>
+            </w:pPr>
+            <w:r/>
+            <w:r>
+              <w:rPr>
+                <w:rFonts w:ascii="맑은 고딕" w:hAnsi="맑은 고딕" w:eastAsia="맑은 고딕"/>
+                <w:b w:val="0"/>
+                <w:sz w:val="18"/>
+              </w:rPr>
+              <w:t>홍보(용역사)</w:t>
+            </w:r>
+          </w:p>
+        </w:tc>
+        <w:tc>
+          <w:tcPr>
+            <w:tcW w:type="dxa" w:w="1133"/>
+          </w:tcPr>
+          <w:p>
+            <w:pPr>
+              <w:jc w:val="left"/>
+            </w:pPr>
+            <w:r/>
+            <w:r>
+              <w:rPr>
+                <w:rFonts w:ascii="맑은 고딕" w:hAnsi="맑은 고딕" w:eastAsia="맑은 고딕"/>
+                <w:b w:val="0"/>
+                <w:sz w:val="18"/>
+              </w:rPr>
+              <w:t>포스터 수정·편집</w:t>
+            </w:r>
+          </w:p>
+        </w:tc>
+      </w:tr>
+      <w:tr>
+        <w:tc>
+          <w:tcPr>
+            <w:tcW w:type="dxa" w:w="1133"/>
+          </w:tcPr>
+          <w:p>
+            <w:pPr>
+              <w:jc w:val="center"/>
+            </w:pPr>
+            <w:r/>
+            <w:r>
+              <w:rPr>
+                <w:rFonts w:ascii="맑은 고딕" w:hAnsi="맑은 고딕" w:eastAsia="맑은 고딕"/>
+                <w:b w:val="0"/>
+                <w:sz w:val="18"/>
+              </w:rPr>
+              <w:t>11</w:t>
             </w:r>
           </w:p>
         </w:tc>
@@ -1565,7 +2109,7 @@
                 <w:b w:val="0"/>
                 <w:sz w:val="18"/>
               </w:rPr>
-              <w:t>114,000</w:t>
+              <w:t>50,000</w:t>
             </w:r>
           </w:p>
         </w:tc>
@@ -1584,7 +2128,7 @@
                 <w:b w:val="0"/>
                 <w:sz w:val="18"/>
               </w:rPr>
-              <w:t>684,000</w:t>
+              <w:t>300,000</w:t>
             </w:r>
           </w:p>
         </w:tc>
@@ -1642,7 +2186,7 @@
                 <w:b w:val="0"/>
                 <w:sz w:val="18"/>
               </w:rPr>
-              <w:t>9</w:t>
+              <w:t>12</w:t>
             </w:r>
           </w:p>
         </w:tc>
@@ -1737,7 +2281,7 @@
                 <w:b w:val="0"/>
                 <w:sz w:val="18"/>
               </w:rPr>
-              <w:t>142,500</w:t>
+              <w:t>100,000</w:t>
             </w:r>
           </w:p>
         </w:tc>
@@ -1756,7 +2300,7 @@
                 <w:b w:val="0"/>
                 <w:sz w:val="18"/>
               </w:rPr>
-              <w:t>1,710,000</w:t>
+              <w:t>1,200,000</w:t>
             </w:r>
           </w:p>
         </w:tc>
@@ -1814,7 +2358,7 @@
                 <w:b w:val="0"/>
                 <w:sz w:val="18"/>
               </w:rPr>
-              <w:t>10</w:t>
+              <w:t>13</w:t>
             </w:r>
           </w:p>
         </w:tc>
@@ -1909,7 +2453,7 @@
                 <w:b w:val="0"/>
                 <w:sz w:val="18"/>
               </w:rPr>
-              <w:t>2,850,000</w:t>
+              <w:t>800,000</w:t>
             </w:r>
           </w:p>
         </w:tc>
@@ -1928,7 +2472,7 @@
                 <w:b w:val="0"/>
                 <w:sz w:val="18"/>
               </w:rPr>
-              <w:t>2,850,000</w:t>
+              <w:t>800,000</w:t>
             </w:r>
           </w:p>
         </w:tc>
@@ -1983,10 +2527,183 @@
             <w:r>
               <w:rPr>
                 <w:rFonts w:ascii="맑은 고딕" w:hAnsi="맑은 고딕" w:eastAsia="맑은 고딕"/>
+                <w:b w:val="0"/>
+                <w:sz w:val="18"/>
+              </w:rPr>
+              <w:t>14</w:t>
+            </w:r>
+          </w:p>
+        </w:tc>
+        <w:tc>
+          <w:tcPr>
+            <w:tcW w:type="dxa" w:w="1133"/>
+          </w:tcPr>
+          <w:p>
+            <w:pPr>
+              <w:jc w:val="center"/>
+            </w:pPr>
+            <w:r/>
+            <w:r>
+              <w:rPr>
+                <w:rFonts w:ascii="맑은 고딕" w:hAnsi="맑은 고딕" w:eastAsia="맑은 고딕"/>
+                <w:b w:val="0"/>
+                <w:sz w:val="18"/>
+              </w:rPr>
+              <w:t>보고</w:t>
+            </w:r>
+          </w:p>
+        </w:tc>
+        <w:tc>
+          <w:tcPr>
+            <w:tcW w:type="dxa" w:w="1133"/>
+          </w:tcPr>
+          <w:p>
+            <w:pPr>
+              <w:jc w:val="left"/>
+            </w:pPr>
+            <w:r/>
+            <w:r>
+              <w:rPr>
+                <w:rFonts w:ascii="맑은 고딕" w:hAnsi="맑은 고딕" w:eastAsia="맑은 고딕"/>
+                <w:b w:val="0"/>
+                <w:sz w:val="18"/>
+              </w:rPr>
+              <w:t>결과보고서 재료 정리 및 저장</w:t>
+            </w:r>
+          </w:p>
+        </w:tc>
+        <w:tc>
+          <w:tcPr>
+            <w:tcW w:type="dxa" w:w="1133"/>
+          </w:tcPr>
+          <w:p>
+            <w:pPr>
+              <w:jc w:val="center"/>
+            </w:pPr>
+            <w:r/>
+            <w:r>
+              <w:rPr>
+                <w:rFonts w:ascii="맑은 고딕" w:hAnsi="맑은 고딕" w:eastAsia="맑은 고딕"/>
+                <w:b w:val="0"/>
+                <w:sz w:val="18"/>
+              </w:rPr>
+              <w:t>식</w:t>
+            </w:r>
+          </w:p>
+        </w:tc>
+        <w:tc>
+          <w:tcPr>
+            <w:tcW w:type="dxa" w:w="1133"/>
+          </w:tcPr>
+          <w:p>
+            <w:pPr>
+              <w:jc w:val="center"/>
+            </w:pPr>
+            <w:r/>
+            <w:r>
+              <w:rPr>
+                <w:rFonts w:ascii="맑은 고딕" w:hAnsi="맑은 고딕" w:eastAsia="맑은 고딕"/>
+                <w:b w:val="0"/>
+                <w:sz w:val="18"/>
+              </w:rPr>
+              <w:t>1</w:t>
+            </w:r>
+          </w:p>
+        </w:tc>
+        <w:tc>
+          <w:tcPr>
+            <w:tcW w:type="dxa" w:w="1133"/>
+          </w:tcPr>
+          <w:p>
+            <w:pPr>
+              <w:jc w:val="right"/>
+            </w:pPr>
+            <w:r/>
+            <w:r>
+              <w:rPr>
+                <w:rFonts w:ascii="맑은 고딕" w:hAnsi="맑은 고딕" w:eastAsia="맑은 고딕"/>
+                <w:b w:val="0"/>
+                <w:sz w:val="18"/>
+              </w:rPr>
+              <w:t>300,000</w:t>
+            </w:r>
+          </w:p>
+        </w:tc>
+        <w:tc>
+          <w:tcPr>
+            <w:tcW w:type="dxa" w:w="1133"/>
+          </w:tcPr>
+          <w:p>
+            <w:pPr>
+              <w:jc w:val="right"/>
+            </w:pPr>
+            <w:r/>
+            <w:r>
+              <w:rPr>
+                <w:rFonts w:ascii="맑은 고딕" w:hAnsi="맑은 고딕" w:eastAsia="맑은 고딕"/>
+                <w:b w:val="0"/>
+                <w:sz w:val="18"/>
+              </w:rPr>
+              <w:t>300,000</w:t>
+            </w:r>
+          </w:p>
+        </w:tc>
+        <w:tc>
+          <w:tcPr>
+            <w:tcW w:type="dxa" w:w="1133"/>
+          </w:tcPr>
+          <w:p>
+            <w:pPr>
+              <w:jc w:val="center"/>
+            </w:pPr>
+            <w:r/>
+            <w:r>
+              <w:rPr>
+                <w:rFonts w:ascii="맑은 고딕" w:hAnsi="맑은 고딕" w:eastAsia="맑은 고딕"/>
+                <w:b w:val="0"/>
+                <w:sz w:val="18"/>
+              </w:rPr>
+              <w:t>행정·운영지원(용역사)</w:t>
+            </w:r>
+          </w:p>
+        </w:tc>
+        <w:tc>
+          <w:tcPr>
+            <w:tcW w:type="dxa" w:w="1133"/>
+          </w:tcPr>
+          <w:p>
+            <w:pPr>
+              <w:jc w:val="left"/>
+            </w:pPr>
+            <w:r/>
+            <w:r>
+              <w:rPr>
+                <w:rFonts w:ascii="맑은 고딕" w:hAnsi="맑은 고딕" w:eastAsia="맑은 고딕"/>
+                <w:b w:val="0"/>
+                <w:sz w:val="18"/>
+              </w:rPr>
+              <w:t>원자료 정리·아카이빙</w:t>
+            </w:r>
+          </w:p>
+        </w:tc>
+      </w:tr>
+      <w:tr>
+        <w:tc>
+          <w:tcPr>
+            <w:tcW w:type="dxa" w:w="1133"/>
+          </w:tcPr>
+          <w:p>
+            <w:pPr>
+              <w:jc w:val="center"/>
+            </w:pPr>
+            <w:r/>
+            <w:r>
+              <w:rPr>
+                <w:rFonts w:ascii="맑은 고딕" w:hAnsi="맑은 고딕" w:eastAsia="맑은 고딕"/>
                 <w:b/>
                 <w:sz w:val="18"/>
               </w:rPr>
-              <w:t>소 계</w:t>
+              <w:t>흰색 소계</w:t>
             </w:r>
           </w:p>
         </w:tc>
@@ -2095,7 +2812,7 @@
                 <w:b/>
                 <w:sz w:val="18"/>
               </w:rPr>
-              <w:t>11,067,500</w:t>
+              <w:t>7,000,000</w:t>
             </w:r>
           </w:p>
         </w:tc>
@@ -2114,7 +2831,7 @@
                 <w:b w:val="0"/>
                 <w:sz w:val="18"/>
               </w:rPr>
-              <w:t>용역사 위탁분(백색)</w:t>
+              <w:t>용역사 위탁분</w:t>
             </w:r>
           </w:p>
         </w:tc>
@@ -2133,7 +2850,7 @@
                 <w:b w:val="0"/>
                 <w:sz w:val="18"/>
               </w:rPr>
-              <w:t>회색 영역 별도</w:t>
+              <w:t>부가세 포함</w:t>
             </w:r>
           </w:p>
         </w:tc>
@@ -2146,7 +2863,7 @@
           <w:color w:val="808080"/>
           <w:sz w:val="17"/>
         </w:rPr>
-        <w:t>※ 회색 영역(강사료·포스터 초안 제작비) 및 SNS 제작비·포스터 수정비 단가는 협의 후 확정 예정입니다.</w:t>
+        <w:t>※ 회색 영역(강사료·포스터 초안·SNS 초안·전체 계획 및 발주 관리·결과보고서 작성)은 온나무 내부에서 직접 수행/정산하며, 본 예산표 합계에서는 별도 산정합니다.</w:t>
       </w:r>
     </w:p>
     <w:sectPr>

</xml_diff>

<commit_message>
Move 사회진행비, 강연자료집 to gray; redistribute to keep white total 7M
</commit_message>
<xml_diff>
--- a/2026_한복인문학특강_상세예산표_내부용.docx
+++ b/2026_한복인문학특강_상세예산표_내부용.docx
@@ -451,6 +451,366 @@
                 <w:b w:val="0"/>
                 <w:sz w:val="18"/>
               </w:rPr>
+              <w:t>인건비</w:t>
+            </w:r>
+          </w:p>
+        </w:tc>
+        <w:tc>
+          <w:tcPr>
+            <w:tcW w:type="dxa" w:w="1133"/>
+            <w:shd w:val="clear" w:color="auto" w:fill="D9D9D9"/>
+          </w:tcPr>
+          <w:p>
+            <w:pPr>
+              <w:jc w:val="left"/>
+            </w:pPr>
+            <w:r/>
+            <w:r>
+              <w:rPr>
+                <w:rFonts w:ascii="맑은 고딕" w:hAnsi="맑은 고딕" w:eastAsia="맑은 고딕"/>
+                <w:b w:val="0"/>
+                <w:sz w:val="18"/>
+              </w:rPr>
+              <w:t>사회진행비</w:t>
+            </w:r>
+          </w:p>
+        </w:tc>
+        <w:tc>
+          <w:tcPr>
+            <w:tcW w:type="dxa" w:w="1133"/>
+            <w:shd w:val="clear" w:color="auto" w:fill="D9D9D9"/>
+          </w:tcPr>
+          <w:p>
+            <w:pPr>
+              <w:jc w:val="center"/>
+            </w:pPr>
+            <w:r/>
+            <w:r>
+              <w:rPr>
+                <w:rFonts w:ascii="맑은 고딕" w:hAnsi="맑은 고딕" w:eastAsia="맑은 고딕"/>
+                <w:b w:val="0"/>
+                <w:sz w:val="18"/>
+              </w:rPr>
+              <w:t>회</w:t>
+            </w:r>
+          </w:p>
+        </w:tc>
+        <w:tc>
+          <w:tcPr>
+            <w:tcW w:type="dxa" w:w="1133"/>
+            <w:shd w:val="clear" w:color="auto" w:fill="D9D9D9"/>
+          </w:tcPr>
+          <w:p>
+            <w:pPr>
+              <w:jc w:val="center"/>
+            </w:pPr>
+            <w:r/>
+            <w:r>
+              <w:rPr>
+                <w:rFonts w:ascii="맑은 고딕" w:hAnsi="맑은 고딕" w:eastAsia="맑은 고딕"/>
+                <w:b w:val="0"/>
+                <w:sz w:val="18"/>
+              </w:rPr>
+              <w:t>6</w:t>
+            </w:r>
+          </w:p>
+        </w:tc>
+        <w:tc>
+          <w:tcPr>
+            <w:tcW w:type="dxa" w:w="1133"/>
+            <w:shd w:val="clear" w:color="auto" w:fill="D9D9D9"/>
+          </w:tcPr>
+          <w:p>
+            <w:pPr>
+              <w:jc w:val="right"/>
+            </w:pPr>
+            <w:r/>
+            <w:r>
+              <w:rPr>
+                <w:rFonts w:ascii="맑은 고딕" w:hAnsi="맑은 고딕" w:eastAsia="맑은 고딕"/>
+                <w:b w:val="0"/>
+                <w:sz w:val="18"/>
+              </w:rPr>
+            </w:r>
+          </w:p>
+        </w:tc>
+        <w:tc>
+          <w:tcPr>
+            <w:tcW w:type="dxa" w:w="1133"/>
+            <w:shd w:val="clear" w:color="auto" w:fill="D9D9D9"/>
+          </w:tcPr>
+          <w:p>
+            <w:pPr>
+              <w:jc w:val="right"/>
+            </w:pPr>
+            <w:r/>
+            <w:r>
+              <w:rPr>
+                <w:rFonts w:ascii="맑은 고딕" w:hAnsi="맑은 고딕" w:eastAsia="맑은 고딕"/>
+                <w:b w:val="0"/>
+                <w:sz w:val="18"/>
+              </w:rPr>
+            </w:r>
+          </w:p>
+        </w:tc>
+        <w:tc>
+          <w:tcPr>
+            <w:tcW w:type="dxa" w:w="1133"/>
+            <w:shd w:val="clear" w:color="auto" w:fill="D9D9D9"/>
+          </w:tcPr>
+          <w:p>
+            <w:pPr>
+              <w:jc w:val="center"/>
+            </w:pPr>
+            <w:r/>
+            <w:r>
+              <w:rPr>
+                <w:rFonts w:ascii="맑은 고딕" w:hAnsi="맑은 고딕" w:eastAsia="맑은 고딕"/>
+                <w:b w:val="0"/>
+                <w:sz w:val="18"/>
+              </w:rPr>
+              <w:t>기획팀(온나무)</w:t>
+            </w:r>
+          </w:p>
+        </w:tc>
+        <w:tc>
+          <w:tcPr>
+            <w:tcW w:type="dxa" w:w="1133"/>
+            <w:shd w:val="clear" w:color="auto" w:fill="D9D9D9"/>
+          </w:tcPr>
+          <w:p>
+            <w:pPr>
+              <w:jc w:val="left"/>
+            </w:pPr>
+            <w:r/>
+            <w:r>
+              <w:rPr>
+                <w:rFonts w:ascii="맑은 고딕" w:hAnsi="맑은 고딕" w:eastAsia="맑은 고딕"/>
+                <w:b w:val="0"/>
+                <w:sz w:val="18"/>
+              </w:rPr>
+              <w:t>사회자 교통비 포함 / 내부 처리</w:t>
+            </w:r>
+          </w:p>
+        </w:tc>
+      </w:tr>
+      <w:tr>
+        <w:tc>
+          <w:tcPr>
+            <w:tcW w:type="dxa" w:w="1133"/>
+            <w:shd w:val="clear" w:color="auto" w:fill="D9D9D9"/>
+          </w:tcPr>
+          <w:p>
+            <w:pPr>
+              <w:jc w:val="center"/>
+            </w:pPr>
+            <w:r/>
+            <w:r>
+              <w:rPr>
+                <w:rFonts w:ascii="맑은 고딕" w:hAnsi="맑은 고딕" w:eastAsia="맑은 고딕"/>
+                <w:b w:val="0"/>
+                <w:sz w:val="18"/>
+              </w:rPr>
+              <w:t>3</w:t>
+            </w:r>
+          </w:p>
+        </w:tc>
+        <w:tc>
+          <w:tcPr>
+            <w:tcW w:type="dxa" w:w="1133"/>
+            <w:shd w:val="clear" w:color="auto" w:fill="D9D9D9"/>
+          </w:tcPr>
+          <w:p>
+            <w:pPr>
+              <w:jc w:val="center"/>
+            </w:pPr>
+            <w:r/>
+            <w:r>
+              <w:rPr>
+                <w:rFonts w:ascii="맑은 고딕" w:hAnsi="맑은 고딕" w:eastAsia="맑은 고딕"/>
+                <w:b w:val="0"/>
+                <w:sz w:val="18"/>
+              </w:rPr>
+              <w:t>인쇄비</w:t>
+            </w:r>
+          </w:p>
+        </w:tc>
+        <w:tc>
+          <w:tcPr>
+            <w:tcW w:type="dxa" w:w="1133"/>
+            <w:shd w:val="clear" w:color="auto" w:fill="D9D9D9"/>
+          </w:tcPr>
+          <w:p>
+            <w:pPr>
+              <w:jc w:val="left"/>
+            </w:pPr>
+            <w:r/>
+            <w:r>
+              <w:rPr>
+                <w:rFonts w:ascii="맑은 고딕" w:hAnsi="맑은 고딕" w:eastAsia="맑은 고딕"/>
+                <w:b w:val="0"/>
+                <w:sz w:val="18"/>
+              </w:rPr>
+              <w:t>강연자료집 제작 및 인쇄</w:t>
+            </w:r>
+          </w:p>
+        </w:tc>
+        <w:tc>
+          <w:tcPr>
+            <w:tcW w:type="dxa" w:w="1133"/>
+            <w:shd w:val="clear" w:color="auto" w:fill="D9D9D9"/>
+          </w:tcPr>
+          <w:p>
+            <w:pPr>
+              <w:jc w:val="center"/>
+            </w:pPr>
+            <w:r/>
+            <w:r>
+              <w:rPr>
+                <w:rFonts w:ascii="맑은 고딕" w:hAnsi="맑은 고딕" w:eastAsia="맑은 고딕"/>
+                <w:b w:val="0"/>
+                <w:sz w:val="18"/>
+              </w:rPr>
+              <w:t>식</w:t>
+            </w:r>
+          </w:p>
+        </w:tc>
+        <w:tc>
+          <w:tcPr>
+            <w:tcW w:type="dxa" w:w="1133"/>
+            <w:shd w:val="clear" w:color="auto" w:fill="D9D9D9"/>
+          </w:tcPr>
+          <w:p>
+            <w:pPr>
+              <w:jc w:val="center"/>
+            </w:pPr>
+            <w:r/>
+            <w:r>
+              <w:rPr>
+                <w:rFonts w:ascii="맑은 고딕" w:hAnsi="맑은 고딕" w:eastAsia="맑은 고딕"/>
+                <w:b w:val="0"/>
+                <w:sz w:val="18"/>
+              </w:rPr>
+              <w:t>1</w:t>
+            </w:r>
+          </w:p>
+        </w:tc>
+        <w:tc>
+          <w:tcPr>
+            <w:tcW w:type="dxa" w:w="1133"/>
+            <w:shd w:val="clear" w:color="auto" w:fill="D9D9D9"/>
+          </w:tcPr>
+          <w:p>
+            <w:pPr>
+              <w:jc w:val="right"/>
+            </w:pPr>
+            <w:r/>
+            <w:r>
+              <w:rPr>
+                <w:rFonts w:ascii="맑은 고딕" w:hAnsi="맑은 고딕" w:eastAsia="맑은 고딕"/>
+                <w:b w:val="0"/>
+                <w:sz w:val="18"/>
+              </w:rPr>
+            </w:r>
+          </w:p>
+        </w:tc>
+        <w:tc>
+          <w:tcPr>
+            <w:tcW w:type="dxa" w:w="1133"/>
+            <w:shd w:val="clear" w:color="auto" w:fill="D9D9D9"/>
+          </w:tcPr>
+          <w:p>
+            <w:pPr>
+              <w:jc w:val="right"/>
+            </w:pPr>
+            <w:r/>
+            <w:r>
+              <w:rPr>
+                <w:rFonts w:ascii="맑은 고딕" w:hAnsi="맑은 고딕" w:eastAsia="맑은 고딕"/>
+                <w:b w:val="0"/>
+                <w:sz w:val="18"/>
+              </w:rPr>
+            </w:r>
+          </w:p>
+        </w:tc>
+        <w:tc>
+          <w:tcPr>
+            <w:tcW w:type="dxa" w:w="1133"/>
+            <w:shd w:val="clear" w:color="auto" w:fill="D9D9D9"/>
+          </w:tcPr>
+          <w:p>
+            <w:pPr>
+              <w:jc w:val="center"/>
+            </w:pPr>
+            <w:r/>
+            <w:r>
+              <w:rPr>
+                <w:rFonts w:ascii="맑은 고딕" w:hAnsi="맑은 고딕" w:eastAsia="맑은 고딕"/>
+                <w:b w:val="0"/>
+                <w:sz w:val="18"/>
+              </w:rPr>
+              <w:t>기획팀(온나무)</w:t>
+            </w:r>
+          </w:p>
+        </w:tc>
+        <w:tc>
+          <w:tcPr>
+            <w:tcW w:type="dxa" w:w="1133"/>
+            <w:shd w:val="clear" w:color="auto" w:fill="D9D9D9"/>
+          </w:tcPr>
+          <w:p>
+            <w:pPr>
+              <w:jc w:val="left"/>
+            </w:pPr>
+            <w:r/>
+            <w:r>
+              <w:rPr>
+                <w:rFonts w:ascii="맑은 고딕" w:hAnsi="맑은 고딕" w:eastAsia="맑은 고딕"/>
+                <w:b w:val="0"/>
+                <w:sz w:val="18"/>
+              </w:rPr>
+              <w:t>내부 처리</w:t>
+            </w:r>
+          </w:p>
+        </w:tc>
+      </w:tr>
+      <w:tr>
+        <w:tc>
+          <w:tcPr>
+            <w:tcW w:type="dxa" w:w="1133"/>
+            <w:shd w:val="clear" w:color="auto" w:fill="D9D9D9"/>
+          </w:tcPr>
+          <w:p>
+            <w:pPr>
+              <w:jc w:val="center"/>
+            </w:pPr>
+            <w:r/>
+            <w:r>
+              <w:rPr>
+                <w:rFonts w:ascii="맑은 고딕" w:hAnsi="맑은 고딕" w:eastAsia="맑은 고딕"/>
+                <w:b w:val="0"/>
+                <w:sz w:val="18"/>
+              </w:rPr>
+              <w:t>4</w:t>
+            </w:r>
+          </w:p>
+        </w:tc>
+        <w:tc>
+          <w:tcPr>
+            <w:tcW w:type="dxa" w:w="1133"/>
+            <w:shd w:val="clear" w:color="auto" w:fill="D9D9D9"/>
+          </w:tcPr>
+          <w:p>
+            <w:pPr>
+              <w:jc w:val="center"/>
+            </w:pPr>
+            <w:r/>
+            <w:r>
+              <w:rPr>
+                <w:rFonts w:ascii="맑은 고딕" w:hAnsi="맑은 고딕" w:eastAsia="맑은 고딕"/>
+                <w:b w:val="0"/>
+                <w:sz w:val="18"/>
+              </w:rPr>
               <w:t>제작비</w:t>
             </w:r>
           </w:p>
@@ -611,7 +971,7 @@
                 <w:b w:val="0"/>
                 <w:sz w:val="18"/>
               </w:rPr>
-              <w:t>3</w:t>
+              <w:t>5</w:t>
             </w:r>
           </w:p>
         </w:tc>
@@ -791,7 +1151,7 @@
                 <w:b w:val="0"/>
                 <w:sz w:val="18"/>
               </w:rPr>
-              <w:t>4</w:t>
+              <w:t>6</w:t>
             </w:r>
           </w:p>
         </w:tc>
@@ -971,7 +1331,7 @@
                 <w:b w:val="0"/>
                 <w:sz w:val="18"/>
               </w:rPr>
-              <w:t>5</w:t>
+              <w:t>7</w:t>
             </w:r>
           </w:p>
         </w:tc>
@@ -1150,180 +1510,7 @@
                 <w:b w:val="0"/>
                 <w:sz w:val="18"/>
               </w:rPr>
-              <w:t>6</w:t>
-            </w:r>
-          </w:p>
-        </w:tc>
-        <w:tc>
-          <w:tcPr>
-            <w:tcW w:type="dxa" w:w="1133"/>
-          </w:tcPr>
-          <w:p>
-            <w:pPr>
-              <w:jc w:val="center"/>
-            </w:pPr>
-            <w:r/>
-            <w:r>
-              <w:rPr>
-                <w:rFonts w:ascii="맑은 고딕" w:hAnsi="맑은 고딕" w:eastAsia="맑은 고딕"/>
-                <w:b w:val="0"/>
-                <w:sz w:val="18"/>
-              </w:rPr>
-              <w:t>인건비</w:t>
-            </w:r>
-          </w:p>
-        </w:tc>
-        <w:tc>
-          <w:tcPr>
-            <w:tcW w:type="dxa" w:w="1133"/>
-          </w:tcPr>
-          <w:p>
-            <w:pPr>
-              <w:jc w:val="left"/>
-            </w:pPr>
-            <w:r/>
-            <w:r>
-              <w:rPr>
-                <w:rFonts w:ascii="맑은 고딕" w:hAnsi="맑은 고딕" w:eastAsia="맑은 고딕"/>
-                <w:b w:val="0"/>
-                <w:sz w:val="18"/>
-              </w:rPr>
-              <w:t>사회진행비</w:t>
-            </w:r>
-          </w:p>
-        </w:tc>
-        <w:tc>
-          <w:tcPr>
-            <w:tcW w:type="dxa" w:w="1133"/>
-          </w:tcPr>
-          <w:p>
-            <w:pPr>
-              <w:jc w:val="center"/>
-            </w:pPr>
-            <w:r/>
-            <w:r>
-              <w:rPr>
-                <w:rFonts w:ascii="맑은 고딕" w:hAnsi="맑은 고딕" w:eastAsia="맑은 고딕"/>
-                <w:b w:val="0"/>
-                <w:sz w:val="18"/>
-              </w:rPr>
-              <w:t>회</w:t>
-            </w:r>
-          </w:p>
-        </w:tc>
-        <w:tc>
-          <w:tcPr>
-            <w:tcW w:type="dxa" w:w="1133"/>
-          </w:tcPr>
-          <w:p>
-            <w:pPr>
-              <w:jc w:val="center"/>
-            </w:pPr>
-            <w:r/>
-            <w:r>
-              <w:rPr>
-                <w:rFonts w:ascii="맑은 고딕" w:hAnsi="맑은 고딕" w:eastAsia="맑은 고딕"/>
-                <w:b w:val="0"/>
-                <w:sz w:val="18"/>
-              </w:rPr>
-              <w:t>6</w:t>
-            </w:r>
-          </w:p>
-        </w:tc>
-        <w:tc>
-          <w:tcPr>
-            <w:tcW w:type="dxa" w:w="1133"/>
-          </w:tcPr>
-          <w:p>
-            <w:pPr>
-              <w:jc w:val="right"/>
-            </w:pPr>
-            <w:r/>
-            <w:r>
-              <w:rPr>
-                <w:rFonts w:ascii="맑은 고딕" w:hAnsi="맑은 고딕" w:eastAsia="맑은 고딕"/>
-                <w:b w:val="0"/>
-                <w:sz w:val="18"/>
-              </w:rPr>
-              <w:t>200,000</w:t>
-            </w:r>
-          </w:p>
-        </w:tc>
-        <w:tc>
-          <w:tcPr>
-            <w:tcW w:type="dxa" w:w="1133"/>
-          </w:tcPr>
-          <w:p>
-            <w:pPr>
-              <w:jc w:val="right"/>
-            </w:pPr>
-            <w:r/>
-            <w:r>
-              <w:rPr>
-                <w:rFonts w:ascii="맑은 고딕" w:hAnsi="맑은 고딕" w:eastAsia="맑은 고딕"/>
-                <w:b w:val="0"/>
-                <w:sz w:val="18"/>
-              </w:rPr>
-              <w:t>1,200,000</w:t>
-            </w:r>
-          </w:p>
-        </w:tc>
-        <w:tc>
-          <w:tcPr>
-            <w:tcW w:type="dxa" w:w="1133"/>
-          </w:tcPr>
-          <w:p>
-            <w:pPr>
-              <w:jc w:val="center"/>
-            </w:pPr>
-            <w:r/>
-            <w:r>
-              <w:rPr>
-                <w:rFonts w:ascii="맑은 고딕" w:hAnsi="맑은 고딕" w:eastAsia="맑은 고딕"/>
-                <w:b w:val="0"/>
-                <w:sz w:val="18"/>
-              </w:rPr>
-              <w:t>현장운영(사회자)</w:t>
-            </w:r>
-          </w:p>
-        </w:tc>
-        <w:tc>
-          <w:tcPr>
-            <w:tcW w:type="dxa" w:w="1133"/>
-          </w:tcPr>
-          <w:p>
-            <w:pPr>
-              <w:jc w:val="left"/>
-            </w:pPr>
-            <w:r/>
-            <w:r>
-              <w:rPr>
-                <w:rFonts w:ascii="맑은 고딕" w:hAnsi="맑은 고딕" w:eastAsia="맑은 고딕"/>
-                <w:b w:val="0"/>
-                <w:sz w:val="18"/>
-              </w:rPr>
-              <w:t>사회자 교통비 포함</w:t>
-            </w:r>
-          </w:p>
-        </w:tc>
-      </w:tr>
-      <w:tr>
-        <w:tc>
-          <w:tcPr>
-            <w:tcW w:type="dxa" w:w="1133"/>
-          </w:tcPr>
-          <w:p>
-            <w:pPr>
-              <w:jc w:val="center"/>
-            </w:pPr>
-            <w:r/>
-            <w:r>
-              <w:rPr>
-                <w:rFonts w:ascii="맑은 고딕" w:hAnsi="맑은 고딕" w:eastAsia="맑은 고딕"/>
-                <w:b w:val="0"/>
-                <w:sz w:val="18"/>
-              </w:rPr>
-              <w:t>7</w:t>
+              <w:t>8</w:t>
             </w:r>
           </w:p>
         </w:tc>
@@ -1418,7 +1605,7 @@
                 <w:b w:val="0"/>
                 <w:sz w:val="18"/>
               </w:rPr>
-              <w:t>1,500,000</w:t>
+              <w:t>2,500,000</w:t>
             </w:r>
           </w:p>
         </w:tc>
@@ -1437,7 +1624,7 @@
                 <w:b w:val="0"/>
                 <w:sz w:val="18"/>
               </w:rPr>
-              <w:t>1,500,000</w:t>
+              <w:t>2,500,000</w:t>
             </w:r>
           </w:p>
         </w:tc>
@@ -1476,178 +1663,6 @@
                 <w:sz w:val="18"/>
               </w:rPr>
               <w:t>최종 결과물 1EA</w:t>
-            </w:r>
-          </w:p>
-        </w:tc>
-      </w:tr>
-      <w:tr>
-        <w:tc>
-          <w:tcPr>
-            <w:tcW w:type="dxa" w:w="1133"/>
-          </w:tcPr>
-          <w:p>
-            <w:pPr>
-              <w:jc w:val="center"/>
-            </w:pPr>
-            <w:r/>
-            <w:r>
-              <w:rPr>
-                <w:rFonts w:ascii="맑은 고딕" w:hAnsi="맑은 고딕" w:eastAsia="맑은 고딕"/>
-                <w:b w:val="0"/>
-                <w:sz w:val="18"/>
-              </w:rPr>
-              <w:t>8</w:t>
-            </w:r>
-          </w:p>
-        </w:tc>
-        <w:tc>
-          <w:tcPr>
-            <w:tcW w:type="dxa" w:w="1133"/>
-          </w:tcPr>
-          <w:p>
-            <w:pPr>
-              <w:jc w:val="center"/>
-            </w:pPr>
-            <w:r/>
-            <w:r>
-              <w:rPr>
-                <w:rFonts w:ascii="맑은 고딕" w:hAnsi="맑은 고딕" w:eastAsia="맑은 고딕"/>
-                <w:b w:val="0"/>
-                <w:sz w:val="18"/>
-              </w:rPr>
-              <w:t>인쇄비</w:t>
-            </w:r>
-          </w:p>
-        </w:tc>
-        <w:tc>
-          <w:tcPr>
-            <w:tcW w:type="dxa" w:w="1133"/>
-          </w:tcPr>
-          <w:p>
-            <w:pPr>
-              <w:jc w:val="left"/>
-            </w:pPr>
-            <w:r/>
-            <w:r>
-              <w:rPr>
-                <w:rFonts w:ascii="맑은 고딕" w:hAnsi="맑은 고딕" w:eastAsia="맑은 고딕"/>
-                <w:b w:val="0"/>
-                <w:sz w:val="18"/>
-              </w:rPr>
-              <w:t>강연자료집 제작 및 인쇄</w:t>
-            </w:r>
-          </w:p>
-        </w:tc>
-        <w:tc>
-          <w:tcPr>
-            <w:tcW w:type="dxa" w:w="1133"/>
-          </w:tcPr>
-          <w:p>
-            <w:pPr>
-              <w:jc w:val="center"/>
-            </w:pPr>
-            <w:r/>
-            <w:r>
-              <w:rPr>
-                <w:rFonts w:ascii="맑은 고딕" w:hAnsi="맑은 고딕" w:eastAsia="맑은 고딕"/>
-                <w:b w:val="0"/>
-                <w:sz w:val="18"/>
-              </w:rPr>
-              <w:t>식</w:t>
-            </w:r>
-          </w:p>
-        </w:tc>
-        <w:tc>
-          <w:tcPr>
-            <w:tcW w:type="dxa" w:w="1133"/>
-          </w:tcPr>
-          <w:p>
-            <w:pPr>
-              <w:jc w:val="center"/>
-            </w:pPr>
-            <w:r/>
-            <w:r>
-              <w:rPr>
-                <w:rFonts w:ascii="맑은 고딕" w:hAnsi="맑은 고딕" w:eastAsia="맑은 고딕"/>
-                <w:b w:val="0"/>
-                <w:sz w:val="18"/>
-              </w:rPr>
-              <w:t>1</w:t>
-            </w:r>
-          </w:p>
-        </w:tc>
-        <w:tc>
-          <w:tcPr>
-            <w:tcW w:type="dxa" w:w="1133"/>
-          </w:tcPr>
-          <w:p>
-            <w:pPr>
-              <w:jc w:val="right"/>
-            </w:pPr>
-            <w:r/>
-            <w:r>
-              <w:rPr>
-                <w:rFonts w:ascii="맑은 고딕" w:hAnsi="맑은 고딕" w:eastAsia="맑은 고딕"/>
-                <w:b w:val="0"/>
-                <w:sz w:val="18"/>
-              </w:rPr>
-              <w:t>1,000,000</w:t>
-            </w:r>
-          </w:p>
-        </w:tc>
-        <w:tc>
-          <w:tcPr>
-            <w:tcW w:type="dxa" w:w="1133"/>
-          </w:tcPr>
-          <w:p>
-            <w:pPr>
-              <w:jc w:val="right"/>
-            </w:pPr>
-            <w:r/>
-            <w:r>
-              <w:rPr>
-                <w:rFonts w:ascii="맑은 고딕" w:hAnsi="맑은 고딕" w:eastAsia="맑은 고딕"/>
-                <w:b w:val="0"/>
-                <w:sz w:val="18"/>
-              </w:rPr>
-              <w:t>1,000,000</w:t>
-            </w:r>
-          </w:p>
-        </w:tc>
-        <w:tc>
-          <w:tcPr>
-            <w:tcW w:type="dxa" w:w="1133"/>
-          </w:tcPr>
-          <w:p>
-            <w:pPr>
-              <w:jc w:val="center"/>
-            </w:pPr>
-            <w:r/>
-            <w:r>
-              <w:rPr>
-                <w:rFonts w:ascii="맑은 고딕" w:hAnsi="맑은 고딕" w:eastAsia="맑은 고딕"/>
-                <w:b w:val="0"/>
-                <w:sz w:val="18"/>
-              </w:rPr>
-              <w:t>제작·인쇄(용역사)</w:t>
-            </w:r>
-          </w:p>
-        </w:tc>
-        <w:tc>
-          <w:tcPr>
-            <w:tcW w:type="dxa" w:w="1133"/>
-          </w:tcPr>
-          <w:p>
-            <w:pPr>
-              <w:jc w:val="left"/>
-            </w:pPr>
-            <w:r/>
-            <w:r>
-              <w:rPr>
-                <w:rFonts w:ascii="맑은 고딕" w:hAnsi="맑은 고딕" w:eastAsia="맑은 고딕"/>
-                <w:b w:val="0"/>
-                <w:sz w:val="18"/>
-              </w:rPr>
             </w:r>
           </w:p>
         </w:tc>
@@ -1763,7 +1778,7 @@
                 <w:b w:val="0"/>
                 <w:sz w:val="18"/>
               </w:rPr>
-              <w:t>400,000</w:t>
+              <w:t>600,000</w:t>
             </w:r>
           </w:p>
         </w:tc>
@@ -1782,7 +1797,7 @@
                 <w:b w:val="0"/>
                 <w:sz w:val="18"/>
               </w:rPr>
-              <w:t>400,000</w:t>
+              <w:t>600,000</w:t>
             </w:r>
           </w:p>
         </w:tc>
@@ -1936,7 +1951,7 @@
                 <w:b w:val="0"/>
                 <w:sz w:val="18"/>
               </w:rPr>
-              <w:t>300,000</w:t>
+              <w:t>500,000</w:t>
             </w:r>
           </w:p>
         </w:tc>
@@ -1955,7 +1970,7 @@
                 <w:b w:val="0"/>
                 <w:sz w:val="18"/>
               </w:rPr>
-              <w:t>300,000</w:t>
+              <w:t>500,000</w:t>
             </w:r>
           </w:p>
         </w:tc>
@@ -2109,7 +2124,7 @@
                 <w:b w:val="0"/>
                 <w:sz w:val="18"/>
               </w:rPr>
-              <w:t>50,000</w:t>
+              <w:t>80,000</w:t>
             </w:r>
           </w:p>
         </w:tc>
@@ -2128,7 +2143,7 @@
                 <w:b w:val="0"/>
                 <w:sz w:val="18"/>
               </w:rPr>
-              <w:t>300,000</w:t>
+              <w:t>480,000</w:t>
             </w:r>
           </w:p>
         </w:tc>
@@ -2281,7 +2296,7 @@
                 <w:b w:val="0"/>
                 <w:sz w:val="18"/>
               </w:rPr>
-              <w:t>100,000</w:t>
+              <w:t>130,000</w:t>
             </w:r>
           </w:p>
         </w:tc>
@@ -2300,7 +2315,7 @@
                 <w:b w:val="0"/>
                 <w:sz w:val="18"/>
               </w:rPr>
-              <w:t>1,200,000</w:t>
+              <w:t>1,560,000</w:t>
             </w:r>
           </w:p>
         </w:tc>
@@ -2453,7 +2468,7 @@
                 <w:b w:val="0"/>
                 <w:sz w:val="18"/>
               </w:rPr>
-              <w:t>800,000</w:t>
+              <w:t>860,000</w:t>
             </w:r>
           </w:p>
         </w:tc>
@@ -2472,7 +2487,7 @@
                 <w:b w:val="0"/>
                 <w:sz w:val="18"/>
               </w:rPr>
-              <w:t>800,000</w:t>
+              <w:t>860,000</w:t>
             </w:r>
           </w:p>
         </w:tc>
@@ -2625,7 +2640,7 @@
                 <w:b w:val="0"/>
                 <w:sz w:val="18"/>
               </w:rPr>
-              <w:t>300,000</w:t>
+              <w:t>500,000</w:t>
             </w:r>
           </w:p>
         </w:tc>
@@ -2644,7 +2659,7 @@
                 <w:b w:val="0"/>
                 <w:sz w:val="18"/>
               </w:rPr>
-              <w:t>300,000</w:t>
+              <w:t>500,000</w:t>
             </w:r>
           </w:p>
         </w:tc>

</xml_diff>